<commit_message>
Paper 1 v0.5: dashboard and Word review re-rendered with real superscripts
The affiliation marks (Kulaga Anton^1,2,4,†^) showed as raw pandoc markup in the dashboard and the Word review.
manuscript-skills 0.27.1 renders pandoc superscripts and subscripts; both files are rebuilt from the same
inventory and the same corrected text.

Co-Authored-By: Claude Opus 5.5 <noreply@anthropic.com>
</commit_message>
<xml_diff>
--- a/docs/manuscript/v0.5/paper1-just-dna-lite.review.docx
+++ b/docs/manuscript/v0.5/paper1-just-dna-lite.review.docx
@@ -164,7 +164,123 @@
       </w:r>
       <w:r>
         <w:rPr/>
-        <w:t xml:space="preserve"> Kulaga Anton^1,2,4,†^, Usanov Nikolay^3,4,†^, Borysova Olga^4^, Karmazin Alexey^4^, Koval Maria^4^, Fedorova Alina^4^, Pushkareva Malvina^4^, Evfratov Sergey^4^, Ryangguk Kim^8^, Zaharia Livia^3^, Fuellen Georg^1,*^, Tacutu Robi^2,9,*^</w:t>
+        <w:t xml:space="preserve"> Kulaga Anton</w:t>
+      </w:r>
+      <w:r>
+        <w:rPr>
+          <w:vertAlign w:val="superscript"/>
+        </w:rPr>
+        <w:t>1,2,4,†</w:t>
+      </w:r>
+      <w:r>
+        <w:rPr/>
+        <w:t>, Usanov Nikolay</w:t>
+      </w:r>
+      <w:r>
+        <w:rPr>
+          <w:vertAlign w:val="superscript"/>
+        </w:rPr>
+        <w:t>3,4,†</w:t>
+      </w:r>
+      <w:r>
+        <w:rPr/>
+        <w:t>, Borysova Olga</w:t>
+      </w:r>
+      <w:r>
+        <w:rPr>
+          <w:vertAlign w:val="superscript"/>
+        </w:rPr>
+        <w:t>4</w:t>
+      </w:r>
+      <w:r>
+        <w:rPr/>
+        <w:t>, Karmazin Alexey</w:t>
+      </w:r>
+      <w:r>
+        <w:rPr>
+          <w:vertAlign w:val="superscript"/>
+        </w:rPr>
+        <w:t>4</w:t>
+      </w:r>
+      <w:r>
+        <w:rPr/>
+        <w:t>, Koval Maria</w:t>
+      </w:r>
+      <w:r>
+        <w:rPr>
+          <w:vertAlign w:val="superscript"/>
+        </w:rPr>
+        <w:t>4</w:t>
+      </w:r>
+      <w:r>
+        <w:rPr/>
+        <w:t>, Fedorova Alina</w:t>
+      </w:r>
+      <w:r>
+        <w:rPr>
+          <w:vertAlign w:val="superscript"/>
+        </w:rPr>
+        <w:t>4</w:t>
+      </w:r>
+      <w:r>
+        <w:rPr/>
+        <w:t>, Pushkareva Malvina</w:t>
+      </w:r>
+      <w:r>
+        <w:rPr>
+          <w:vertAlign w:val="superscript"/>
+        </w:rPr>
+        <w:t>4</w:t>
+      </w:r>
+      <w:r>
+        <w:rPr/>
+        <w:t>, Evfratov Sergey</w:t>
+      </w:r>
+      <w:r>
+        <w:rPr>
+          <w:vertAlign w:val="superscript"/>
+        </w:rPr>
+        <w:t>4</w:t>
+      </w:r>
+      <w:r>
+        <w:rPr/>
+        <w:t>, Ryangguk Kim</w:t>
+      </w:r>
+      <w:r>
+        <w:rPr>
+          <w:vertAlign w:val="superscript"/>
+        </w:rPr>
+        <w:t>8</w:t>
+      </w:r>
+      <w:r>
+        <w:rPr/>
+        <w:t>, Zaharia Livia</w:t>
+      </w:r>
+      <w:r>
+        <w:rPr>
+          <w:vertAlign w:val="superscript"/>
+        </w:rPr>
+        <w:t>3</w:t>
+      </w:r>
+      <w:r>
+        <w:rPr/>
+        <w:t>, Fuellen Georg</w:t>
+      </w:r>
+      <w:r>
+        <w:rPr>
+          <w:vertAlign w:val="superscript"/>
+        </w:rPr>
+        <w:t>1,*</w:t>
+      </w:r>
+      <w:r>
+        <w:rPr/>
+        <w:t>, Tacutu Robi</w:t>
+      </w:r>
+      <w:r>
+        <w:rPr>
+          <w:vertAlign w:val="superscript"/>
+        </w:rPr>
+        <w:t>2,9,*</w:t>
       </w:r>
     </w:p>
     <w:p>
@@ -355,7 +471,7 @@
         <w:t xml:space="preserve"> The just-prs library scores through web, command-line, Python and Model Context Protocol </w:t>
       </w:r>
       <w:commentRangeStart w:id="0"/>
-      <w:ins w:id="1" w:author="Story" w:date="2026-10-26T04:32:19Z">
+      <w:ins w:id="1" w:author="Story" w:date="2026-10-26T10:12:21Z">
         <w:r>
           <w:rPr/>
           <w:t xml:space="preserve">(AI-assistant) </w:t>
@@ -495,7 +611,7 @@
         <w:t>often lack an accessible way to annotate them against published databases without specialized bioinformatics expertise</w:t>
       </w:r>
       <w:commentRangeStart w:id="1"/>
-      <w:ins w:id="2" w:author="Reference check" w:date="2026-10-26T04:32:19Z">
+      <w:ins w:id="2" w:author="Reference check" w:date="2026-10-26T10:12:21Z">
         <w:r>
           <w:rPr/>
           <w:t xml:space="preserve"> (Chen et al., 2023)</w:t>
@@ -513,7 +629,7 @@
         </w:rPr>
         <w:commentReference w:id="151"/>
       </w:r>
-      <w:ins w:id="3" w:author="Reference check" w:date="2026-10-26T04:32:19Z">
+      <w:ins w:id="3" w:author="Reference check" w:date="2026-10-26T10:12:21Z">
         <w:r>
           <w:rPr/>
           <w:t>; many turn to third-party interpretation services instead</w:t>
@@ -523,7 +639,7 @@
         <w:rPr/>
         <w:t xml:space="preserve"> (Nelson et al., 2019</w:t>
       </w:r>
-      <w:del w:id="4" w:author="Reference check" w:date="2026-10-26T04:32:19Z">
+      <w:del w:id="4" w:author="Reference check" w:date="2026-10-26T10:12:21Z">
         <w:r>
           <w:rPr/>
           <w:delText>; Chen et al., 2023</w:delText>
@@ -548,13 +664,13 @@
         <w:t xml:space="preserve">By 2025, manufacturers </w:t>
       </w:r>
       <w:commentRangeStart w:id="2"/>
-      <w:del w:id="5" w:author="Workflow" w:date="2026-10-26T04:32:19Z">
+      <w:del w:id="5" w:author="Workflow" w:date="2026-10-26T10:12:21Z">
         <w:r>
           <w:rPr/>
           <w:delText>listed</w:delText>
         </w:r>
       </w:del>
-      <w:ins w:id="6" w:author="Workflow" w:date="2026-10-26T04:32:19Z">
+      <w:ins w:id="6" w:author="Workflow" w:date="2026-10-26T10:12:21Z">
         <w:r>
           <w:rPr/>
           <w:t>advertised</w:t>
@@ -564,13 +680,13 @@
         <w:rPr/>
         <w:t xml:space="preserve"> the sequencing </w:t>
       </w:r>
-      <w:del w:id="7" w:author="Workflow" w:date="2026-10-26T04:32:19Z">
+      <w:del w:id="7" w:author="Workflow" w:date="2026-10-26T10:12:21Z">
         <w:r>
           <w:rPr/>
           <w:delText>consumables for</w:delText>
         </w:r>
       </w:del>
-      <w:ins w:id="8" w:author="Workflow" w:date="2026-10-26T04:32:19Z">
+      <w:ins w:id="8" w:author="Workflow" w:date="2026-10-26T10:12:21Z">
         <w:r>
           <w:rPr/>
           <w:t>of</w:t>
@@ -580,13 +696,13 @@
         <w:rPr/>
         <w:t xml:space="preserve"> a human genome </w:t>
       </w:r>
-      <w:del w:id="9" w:author="Workflow" w:date="2026-10-26T04:32:19Z">
+      <w:del w:id="9" w:author="Workflow" w:date="2026-10-26T10:12:21Z">
         <w:r>
           <w:rPr/>
           <w:delText>at</w:delText>
         </w:r>
       </w:del>
-      <w:ins w:id="10" w:author="Workflow" w:date="2026-10-26T04:32:19Z">
+      <w:ins w:id="10" w:author="Workflow" w:date="2026-10-26T10:12:21Z">
         <w:r>
           <w:rPr/>
           <w:t>for</w:t>
@@ -627,7 +743,7 @@
         <w:t xml:space="preserve"> </w:t>
       </w:r>
       <w:commentRangeStart w:id="3"/>
-      <w:ins w:id="11" w:author="Prose edit" w:date="2026-10-26T04:32:19Z">
+      <w:ins w:id="11" w:author="Prose edit" w:date="2026-10-26T10:12:21Z">
         <w:r>
           <w:rPr/>
           <w:t>The National Human Genome Research Institute (</w:t>
@@ -637,7 +753,7 @@
         <w:rPr/>
         <w:t>NHGRI</w:t>
       </w:r>
-      <w:ins w:id="12" w:author="Prose edit" w:date="2026-10-26T04:32:19Z">
+      <w:ins w:id="12" w:author="Prose edit" w:date="2026-10-26T10:12:21Z">
         <w:r>
           <w:rPr/>
           <w:t>)</w:t>
@@ -698,13 +814,13 @@
         <w:t xml:space="preserve"> Table S7 compares the documented features of </w:t>
       </w:r>
       <w:commentRangeStart w:id="4"/>
-      <w:del w:id="13" w:author="Workflow" w:date="2026-10-26T04:32:19Z">
+      <w:del w:id="13" w:author="Workflow" w:date="2026-10-26T10:12:21Z">
         <w:r>
           <w:rPr/>
           <w:delText>22</w:delText>
         </w:r>
       </w:del>
-      <w:ins w:id="14" w:author="Workflow" w:date="2026-10-26T04:32:19Z">
+      <w:ins w:id="14" w:author="Workflow" w:date="2026-10-26T10:12:21Z">
         <w:r>
           <w:rPr/>
           <w:t>23</w:t>
@@ -747,13 +863,13 @@
         <w:t xml:space="preserve"> After correction for extrinsic mortality, the intrinsic heritability of lifespan has been estimated at about 50%, against 20–25% in twin studies (Shenhar et al., 2026)</w:t>
       </w:r>
       <w:commentRangeStart w:id="5"/>
-      <w:del w:id="15" w:author="Workflow" w:date="2026-10-26T04:32:19Z">
+      <w:del w:id="15" w:author="Workflow" w:date="2026-10-26T10:12:21Z">
         <w:r>
           <w:rPr/>
           <w:delText>,</w:delText>
         </w:r>
       </w:del>
-      <w:ins w:id="16" w:author="Workflow" w:date="2026-10-26T04:32:19Z">
+      <w:ins w:id="16" w:author="Workflow" w:date="2026-10-26T10:12:21Z">
         <w:r>
           <w:rPr/>
           <w:t>.</w:t>
@@ -763,13 +879,13 @@
         <w:rPr/>
         <w:t xml:space="preserve"> </w:t>
       </w:r>
-      <w:del w:id="17" w:author="Workflow" w:date="2026-10-26T04:32:19Z">
+      <w:del w:id="17" w:author="Workflow" w:date="2026-10-26T10:12:21Z">
         <w:r>
           <w:rPr/>
           <w:delText>and</w:delText>
         </w:r>
       </w:del>
-      <w:ins w:id="18" w:author="Workflow" w:date="2026-10-26T04:32:19Z">
+      <w:ins w:id="18" w:author="Workflow" w:date="2026-10-26T10:12:21Z">
         <w:r>
           <w:rPr/>
           <w:t>Genetic</w:t>
@@ -780,13 +896,13 @@
         <w:t xml:space="preserve"> </w:t>
       </w:r>
       <w:commentRangeStart w:id="150"/>
-      <w:del w:id="19" w:author="Workflow" w:date="2026-10-26T04:32:19Z">
+      <w:del w:id="19" w:author="Workflow" w:date="2026-10-26T10:12:21Z">
         <w:r>
           <w:rPr/>
           <w:delText>GWAS</w:delText>
         </w:r>
       </w:del>
-      <w:ins w:id="20" w:author="Workflow" w:date="2026-10-26T04:32:19Z">
+      <w:ins w:id="20" w:author="Workflow" w:date="2026-10-26T10:12:21Z">
         <w:r>
           <w:rPr/>
           <w:t>association studies</w:t>
@@ -824,13 +940,13 @@
         <w:commentReference w:id="162"/>
       </w:r>
       <w:commentRangeStart w:id="6"/>
-      <w:del w:id="21" w:author="Workflow" w:date="2026-10-26T04:32:19Z">
+      <w:del w:id="21" w:author="Workflow" w:date="2026-10-26T10:12:21Z">
         <w:r>
           <w:rPr/>
           <w:delText>variant-trait</w:delText>
         </w:r>
       </w:del>
-      <w:ins w:id="22" w:author="Workflow" w:date="2026-10-26T04:32:19Z">
+      <w:ins w:id="22" w:author="Workflow" w:date="2026-10-26T10:12:21Z">
         <w:r>
           <w:rPr/>
           <w:t>variants</w:t>
@@ -840,7 +956,7 @@
         <w:rPr/>
         <w:t xml:space="preserve"> </w:t>
       </w:r>
-      <w:del w:id="23" w:author="Workflow" w:date="2026-10-26T04:32:19Z">
+      <w:del w:id="23" w:author="Workflow" w:date="2026-10-26T10:12:21Z">
         <w:r>
           <w:rPr/>
           <w:delText>associations</w:delText>
@@ -853,7 +969,7 @@
         </w:rPr>
         <w:commentReference w:id="149"/>
       </w:r>
-      <w:ins w:id="24" w:author="Workflow" w:date="2026-10-26T04:32:19Z">
+      <w:ins w:id="24" w:author="Workflow" w:date="2026-10-26T10:12:21Z">
         <w:r>
           <w:rPr/>
           <w:t>tested for association with longevity</w:t>
@@ -897,13 +1013,13 @@
         <w:commentReference w:id="167"/>
       </w:r>
       <w:commentRangeStart w:id="7"/>
-      <w:del w:id="25" w:author="Story" w:date="2026-10-26T04:32:19Z">
+      <w:del w:id="25" w:author="Story" w:date="2026-10-26T10:12:21Z">
         <w:r>
           <w:rPr/>
           <w:delText>,</w:delText>
         </w:r>
       </w:del>
-      <w:ins w:id="26" w:author="Story" w:date="2026-10-26T04:32:19Z">
+      <w:ins w:id="26" w:author="Story" w:date="2026-10-26T10:12:21Z">
         <w:r>
           <w:rPr/>
           <w:t>.</w:t>
@@ -913,13 +1029,13 @@
         <w:rPr/>
         <w:t xml:space="preserve"> </w:t>
       </w:r>
-      <w:del w:id="27" w:author="Story" w:date="2026-10-26T04:32:19Z">
+      <w:del w:id="27" w:author="Story" w:date="2026-10-26T10:12:21Z">
         <w:r>
           <w:rPr/>
           <w:delText>and</w:delText>
         </w:r>
       </w:del>
-      <w:ins w:id="28" w:author="Story" w:date="2026-10-26T04:32:19Z">
+      <w:ins w:id="28" w:author="Story" w:date="2026-10-26T10:12:21Z">
         <w:r>
           <w:rPr/>
           <w:t>It</w:t>
@@ -929,13 +1045,13 @@
         <w:rPr/>
         <w:t xml:space="preserve"> </w:t>
       </w:r>
-      <w:del w:id="29" w:author="Story" w:date="2026-10-26T04:32:19Z">
+      <w:del w:id="29" w:author="Story" w:date="2026-10-26T10:12:21Z">
         <w:r>
           <w:rPr/>
           <w:delText>it</w:delText>
         </w:r>
       </w:del>
-      <w:ins w:id="30" w:author="Story" w:date="2026-10-26T04:32:19Z">
+      <w:ins w:id="30" w:author="Story" w:date="2026-10-26T10:12:21Z">
         <w:r>
           <w:rPr/>
           <w:t>also</w:t>
@@ -945,13 +1061,13 @@
         <w:rPr/>
         <w:t xml:space="preserve"> has to protect privacy</w:t>
       </w:r>
-      <w:del w:id="31" w:author="Story" w:date="2026-10-26T04:32:19Z">
+      <w:del w:id="31" w:author="Story" w:date="2026-10-26T10:12:21Z">
         <w:r>
           <w:rPr/>
           <w:delText>:</w:delText>
         </w:r>
       </w:del>
-      <w:ins w:id="32" w:author="Story" w:date="2026-10-26T04:32:19Z">
+      <w:ins w:id="32" w:author="Story" w:date="2026-10-26T10:12:21Z">
         <w:r>
           <w:rPr/>
           <w:t>.</w:t>
@@ -961,13 +1077,13 @@
         <w:rPr/>
         <w:t xml:space="preserve"> </w:t>
       </w:r>
-      <w:del w:id="33" w:author="Story" w:date="2026-10-26T04:32:19Z">
+      <w:del w:id="33" w:author="Story" w:date="2026-10-26T10:12:21Z">
         <w:r>
           <w:rPr/>
           <w:delText>genomic</w:delText>
         </w:r>
       </w:del>
-      <w:ins w:id="34" w:author="Story" w:date="2026-10-26T04:32:19Z">
+      <w:ins w:id="34" w:author="Story" w:date="2026-10-26T10:12:21Z">
         <w:r>
           <w:rPr/>
           <w:t>Genomic</w:t>
@@ -985,7 +1101,7 @@
         <w:t xml:space="preserve"> data are among the most sensitive personal information, and uploading them to third-party servers carries risks that individuals and regulations such as the </w:t>
       </w:r>
       <w:commentRangeStart w:id="8"/>
-      <w:ins w:id="35" w:author="Prose edit" w:date="2026-10-26T04:32:19Z">
+      <w:ins w:id="35" w:author="Prose edit" w:date="2026-10-26T10:12:21Z">
         <w:r>
           <w:rPr/>
           <w:t>General Data Protection Regulation (</w:t>
@@ -995,7 +1111,7 @@
         <w:rPr/>
         <w:t>GDPR</w:t>
       </w:r>
-      <w:ins w:id="36" w:author="Prose edit" w:date="2026-10-26T04:32:19Z">
+      <w:ins w:id="36" w:author="Prose edit" w:date="2026-10-26T10:12:21Z">
         <w:r>
           <w:rPr/>
           <w:t>)</w:t>
@@ -1036,7 +1152,7 @@
         <w:t xml:space="preserve"> Supplementary </w:t>
       </w:r>
       <w:commentRangeStart w:id="9"/>
-      <w:del w:id="37" w:author="Prose edit" w:date="2026-10-26T04:32:19Z">
+      <w:del w:id="37" w:author="Prose edit" w:date="2026-10-26T10:12:21Z">
         <w:r>
           <w:rPr/>
           <w:delText xml:space="preserve">File </w:delText>
@@ -1138,7 +1254,7 @@
         <w:t>The pipeline is built from Dagster (Dagster Labs, 2026) software-defined assets, which record data lineage and</w:t>
       </w:r>
       <w:commentRangeStart w:id="10"/>
-      <w:del w:id="38" w:author="Workflow" w:date="2026-10-26T04:32:19Z">
+      <w:del w:id="38" w:author="Workflow" w:date="2026-10-26T10:12:21Z">
         <w:r>
           <w:rPr/>
           <w:delText xml:space="preserve"> the CPU time</w:delText>
@@ -1148,13 +1264,13 @@
         <w:rPr/>
         <w:t xml:space="preserve">, </w:t>
       </w:r>
-      <w:del w:id="39" w:author="Workflow" w:date="2026-10-26T04:32:19Z">
+      <w:del w:id="39" w:author="Workflow" w:date="2026-10-26T10:12:21Z">
         <w:r>
           <w:rPr/>
           <w:delText>peak memory and duration of</w:delText>
         </w:r>
       </w:del>
-      <w:ins w:id="40" w:author="Workflow" w:date="2026-10-26T04:32:19Z">
+      <w:ins w:id="40" w:author="Workflow" w:date="2026-10-26T10:12:21Z">
         <w:r>
           <w:rPr/>
           <w:t>for</w:t>
@@ -1171,7 +1287,7 @@
         </w:rPr>
         <w:commentReference w:id="96"/>
       </w:r>
-      <w:ins w:id="41" w:author="Workflow" w:date="2026-10-26T04:32:19Z">
+      <w:ins w:id="41" w:author="Workflow" w:date="2026-10-26T10:12:21Z">
         <w:r>
           <w:rPr/>
           <w:t>, its duration, CPU use and resident memory at the step's start and end</w:t>
@@ -1246,7 +1362,7 @@
         <w:t xml:space="preserve">): only variants passing specified FILTER values (by default, PASS and ".") are retained, with </w:t>
       </w:r>
       <w:commentRangeStart w:id="11"/>
-      <w:del w:id="42" w:author="Workflow" w:date="2026-10-26T04:32:19Z">
+      <w:del w:id="42" w:author="Workflow" w:date="2026-10-26T10:12:21Z">
         <w:r>
           <w:rPr/>
           <w:delText xml:space="preserve">optional </w:delText>
@@ -1263,13 +1379,13 @@
         </w:rPr>
         <w:commentReference w:id="94"/>
       </w:r>
-      <w:ins w:id="43" w:author="Workflow" w:date="2026-10-26T04:32:19Z">
+      <w:ins w:id="43" w:author="Workflow" w:date="2026-10-26T10:12:21Z">
         <w:r>
           <w:rPr/>
           <w:t xml:space="preserve"> that are on by default and can be turned off.</w:t>
         </w:r>
       </w:ins>
-      <w:ins w:id="44" w:author="Workflow" w:date="2026-10-26T04:32:19Z">
+      <w:ins w:id="44" w:author="Workflow" w:date="2026-10-26T10:12:21Z">
         <w:r>
           <w:rPr/>
           <w:t xml:space="preserve"> A passing record that states no depth or quality is judged by its FILTER value alone</w:t>
@@ -1303,13 +1419,13 @@
         <w:t xml:space="preserve"> The normalized data </w:t>
       </w:r>
       <w:commentRangeStart w:id="12"/>
-      <w:del w:id="45" w:author="Prose edit" w:date="2026-10-26T04:32:19Z">
+      <w:del w:id="45" w:author="Prose edit" w:date="2026-10-26T10:12:21Z">
         <w:r>
           <w:rPr/>
           <w:delText>is</w:delText>
         </w:r>
       </w:del>
-      <w:ins w:id="46" w:author="Prose edit" w:date="2026-10-26T04:32:19Z">
+      <w:ins w:id="46" w:author="Prose edit" w:date="2026-10-26T10:12:21Z">
         <w:r>
           <w:rPr/>
           <w:t>are</w:t>
@@ -1360,19 +1476,19 @@
         <w:t>)</w:t>
       </w:r>
       <w:commentRangeStart w:id="13"/>
-      <w:del w:id="47" w:author="Workflow" w:date="2026-10-26T04:32:19Z">
+      <w:del w:id="47" w:author="Workflow" w:date="2026-10-26T10:12:21Z">
         <w:r>
           <w:rPr/>
           <w:delText>:</w:delText>
         </w:r>
       </w:del>
-      <w:ins w:id="48" w:author="Workflow" w:date="2026-10-26T04:32:19Z">
+      <w:ins w:id="48" w:author="Workflow" w:date="2026-10-26T10:12:21Z">
         <w:r>
           <w:rPr/>
           <w:t>.</w:t>
         </w:r>
       </w:ins>
-      <w:ins w:id="49" w:author="Workflow" w:date="2026-10-26T04:32:19Z">
+      <w:ins w:id="49" w:author="Workflow" w:date="2026-10-26T10:12:21Z">
         <w:r>
           <w:rPr/>
           <w:t xml:space="preserve"> The join is</w:t>
@@ -1383,7 +1499,7 @@
         <w:rPr/>
         <w:t xml:space="preserve"> by </w:t>
       </w:r>
-      <w:ins w:id="50" w:author="Workflow" w:date="2026-10-26T04:32:19Z">
+      <w:ins w:id="50" w:author="Workflow" w:date="2026-10-26T10:12:21Z">
         <w:r>
           <w:rPr/>
           <w:t xml:space="preserve">chromosome, </w:t>
@@ -1393,7 +1509,7 @@
         <w:rPr/>
         <w:t>position</w:t>
       </w:r>
-      <w:ins w:id="51" w:author="Workflow" w:date="2026-10-26T04:32:19Z">
+      <w:ins w:id="51" w:author="Workflow" w:date="2026-10-26T10:12:21Z">
         <w:r>
           <w:rPr/>
           <w:t xml:space="preserve"> and genotype</w:t>
@@ -1410,13 +1526,13 @@
         </w:rPr>
         <w:commentReference w:id="112"/>
       </w:r>
-      <w:ins w:id="52" w:author="Workflow" w:date="2026-10-26T04:32:19Z">
+      <w:ins w:id="52" w:author="Workflow" w:date="2026-10-26T10:12:21Z">
         <w:r>
           <w:rPr/>
           <w:t>.</w:t>
         </w:r>
       </w:ins>
-      <w:ins w:id="53" w:author="Workflow" w:date="2026-10-26T04:32:19Z">
+      <w:ins w:id="53" w:author="Workflow" w:date="2026-10-26T10:12:21Z">
         <w:r>
           <w:rPr/>
           <w:t xml:space="preserve"> Genotypes</w:t>
@@ -1426,13 +1542,13 @@
         <w:rPr/>
         <w:t xml:space="preserve">, </w:t>
       </w:r>
-      <w:del w:id="54" w:author="Workflow" w:date="2026-10-26T04:32:19Z">
+      <w:del w:id="54" w:author="Workflow" w:date="2026-10-26T10:12:21Z">
         <w:r>
           <w:rPr/>
           <w:delText>or</w:delText>
         </w:r>
       </w:del>
-      <w:ins w:id="55" w:author="Workflow" w:date="2026-10-26T04:32:19Z">
+      <w:ins w:id="55" w:author="Workflow" w:date="2026-10-26T10:12:21Z">
         <w:r>
           <w:rPr/>
           <w:t>the</w:t>
@@ -1442,13 +1558,13 @@
         <w:rPr/>
         <w:t xml:space="preserve"> </w:t>
       </w:r>
-      <w:del w:id="56" w:author="Workflow" w:date="2026-10-26T04:32:19Z">
+      <w:del w:id="56" w:author="Workflow" w:date="2026-10-26T10:12:21Z">
         <w:r>
           <w:rPr/>
           <w:delText>by</w:delText>
         </w:r>
       </w:del>
-      <w:ins w:id="57" w:author="Workflow" w:date="2026-10-26T04:32:19Z">
+      <w:ins w:id="57" w:author="Workflow" w:date="2026-10-26T10:12:21Z">
         <w:r>
           <w:rPr/>
           <w:t>alleles</w:t>
@@ -1458,13 +1574,13 @@
         <w:rPr/>
         <w:t xml:space="preserve"> </w:t>
       </w:r>
-      <w:del w:id="58" w:author="Workflow" w:date="2026-10-26T04:32:19Z">
+      <w:del w:id="58" w:author="Workflow" w:date="2026-10-26T10:12:21Z">
         <w:r>
           <w:rPr/>
           <w:delText>rsID</w:delText>
         </w:r>
       </w:del>
-      <w:ins w:id="59" w:author="Workflow" w:date="2026-10-26T04:32:19Z">
+      <w:ins w:id="59" w:author="Workflow" w:date="2026-10-26T10:12:21Z">
         <w:r>
           <w:rPr/>
           <w:t>the</w:t>
@@ -1474,13 +1590,13 @@
         <w:rPr/>
         <w:t xml:space="preserve"> </w:t>
       </w:r>
-      <w:del w:id="60" w:author="Workflow" w:date="2026-10-26T04:32:19Z">
+      <w:del w:id="60" w:author="Workflow" w:date="2026-10-26T10:12:21Z">
         <w:r>
           <w:rPr/>
           <w:delText>for</w:delText>
         </w:r>
       </w:del>
-      <w:ins w:id="61" w:author="Workflow" w:date="2026-10-26T04:32:19Z">
+      <w:ins w:id="61" w:author="Workflow" w:date="2026-10-26T10:12:21Z">
         <w:r>
           <w:rPr/>
           <w:t>sample</w:t>
@@ -1490,19 +1606,19 @@
         <w:rPr/>
         <w:t xml:space="preserve"> </w:t>
       </w:r>
-      <w:del w:id="62" w:author="Workflow" w:date="2026-10-26T04:32:19Z">
+      <w:del w:id="62" w:author="Workflow" w:date="2026-10-26T10:12:21Z">
         <w:r>
           <w:rPr/>
           <w:delText>older</w:delText>
         </w:r>
       </w:del>
-      <w:ins w:id="63" w:author="Workflow" w:date="2026-10-26T04:32:19Z">
+      <w:ins w:id="63" w:author="Workflow" w:date="2026-10-26T10:12:21Z">
         <w:r>
           <w:rPr/>
           <w:t>carries, are compared as written, so an indel matches only when the VCF and the module spell it the same way.</w:t>
         </w:r>
       </w:ins>
-      <w:ins w:id="64" w:author="Workflow" w:date="2026-10-26T04:32:19Z">
+      <w:ins w:id="64" w:author="Workflow" w:date="2026-10-26T10:12:21Z">
         <w:r>
           <w:rPr/>
           <w:t xml:space="preserve"> Older</w:t>
@@ -1512,7 +1628,7 @@
         <w:rPr/>
         <w:t xml:space="preserve"> modules without coordinates</w:t>
       </w:r>
-      <w:ins w:id="65" w:author="Workflow" w:date="2026-10-26T04:32:19Z">
+      <w:ins w:id="65" w:author="Workflow" w:date="2026-10-26T10:12:21Z">
         <w:r>
           <w:rPr/>
           <w:t xml:space="preserve"> are joined by rsID and genotype; such a module is listed as not read, with the reason, when the VCF carries no rsIDs</w:t>
@@ -1553,7 +1669,7 @@
         <w:t xml:space="preserve"> When enabled, the pipeline also joins the normalized VCF against the Ensembl Variation database (Dyer et al., 2025)</w:t>
       </w:r>
       <w:commentRangeStart w:id="14"/>
-      <w:ins w:id="66" w:author="Story" w:date="2026-10-26T04:32:19Z">
+      <w:ins w:id="66" w:author="Story" w:date="2026-10-26T10:12:21Z">
         <w:r>
           <w:rPr/>
           <w:t>.</w:t>
@@ -1572,13 +1688,13 @@
       </w:r>
       <w:commentRangeStart w:id="15"/>
       <w:commentRangeStart w:id="89"/>
-      <w:del w:id="67" w:author="Workflow" w:date="2026-10-26T04:32:19Z">
+      <w:del w:id="67" w:author="Workflow" w:date="2026-10-26T10:12:21Z">
         <w:r>
           <w:rPr/>
           <w:delText>to</w:delText>
         </w:r>
       </w:del>
-      <w:ins w:id="68" w:author="Workflow" w:date="2026-10-26T04:32:19Z">
+      <w:ins w:id="68" w:author="Workflow" w:date="2026-10-26T10:12:21Z">
         <w:r>
           <w:rPr/>
           <w:t>For</w:t>
@@ -1588,13 +1704,13 @@
         <w:rPr/>
         <w:t xml:space="preserve"> </w:t>
       </w:r>
-      <w:del w:id="69" w:author="Workflow" w:date="2026-10-26T04:32:19Z">
+      <w:del w:id="69" w:author="Workflow" w:date="2026-10-26T10:12:21Z">
         <w:r>
           <w:rPr/>
           <w:delText>add</w:delText>
         </w:r>
       </w:del>
-      <w:ins w:id="70" w:author="Workflow" w:date="2026-10-26T04:32:19Z">
+      <w:ins w:id="70" w:author="Workflow" w:date="2026-10-26T10:12:21Z">
         <w:r>
           <w:rPr/>
           <w:t>each variant, it adds</w:t>
@@ -1604,7 +1720,7 @@
         <w:rPr/>
         <w:t xml:space="preserve"> clinical </w:t>
       </w:r>
-      <w:ins w:id="71" w:author="Workflow" w:date="2026-10-26T04:32:19Z">
+      <w:ins w:id="71" w:author="Workflow" w:date="2026-10-26T10:12:21Z">
         <w:r>
           <w:rPr/>
           <w:t>-</w:t>
@@ -1614,13 +1730,13 @@
         <w:rPr/>
         <w:t xml:space="preserve">significance </w:t>
       </w:r>
-      <w:del w:id="72" w:author="Workflow" w:date="2026-10-26T04:32:19Z">
+      <w:del w:id="72" w:author="Workflow" w:date="2026-10-26T10:12:21Z">
         <w:r>
           <w:rPr/>
           <w:delText>labels</w:delText>
         </w:r>
       </w:del>
-      <w:ins w:id="73" w:author="Workflow" w:date="2026-10-26T04:32:19Z">
+      <w:ins w:id="73" w:author="Workflow" w:date="2026-10-26T10:12:21Z">
         <w:r>
           <w:rPr/>
           <w:t>flags</w:t>
@@ -1630,13 +1746,13 @@
         <w:rPr/>
         <w:t xml:space="preserve">, </w:t>
       </w:r>
-      <w:del w:id="74" w:author="Workflow" w:date="2026-10-26T04:32:19Z">
+      <w:del w:id="74" w:author="Workflow" w:date="2026-10-26T10:12:21Z">
         <w:r>
           <w:rPr/>
           <w:delText>consequence</w:delText>
         </w:r>
       </w:del>
-      <w:ins w:id="75" w:author="Workflow" w:date="2026-10-26T04:32:19Z">
+      <w:ins w:id="75" w:author="Workflow" w:date="2026-10-26T10:12:21Z">
         <w:r>
           <w:rPr/>
           <w:t>the</w:t>
@@ -1646,13 +1762,13 @@
         <w:rPr/>
         <w:t xml:space="preserve"> </w:t>
       </w:r>
-      <w:del w:id="76" w:author="Workflow" w:date="2026-10-26T04:32:19Z">
+      <w:del w:id="76" w:author="Workflow" w:date="2026-10-26T10:12:21Z">
         <w:r>
           <w:rPr/>
           <w:delText>types</w:delText>
         </w:r>
       </w:del>
-      <w:ins w:id="77" w:author="Workflow" w:date="2026-10-26T04:32:19Z">
+      <w:ins w:id="77" w:author="Workflow" w:date="2026-10-26T10:12:21Z">
         <w:r>
           <w:rPr/>
           <w:t>variant class (such as SNV</w:t>
@@ -1662,7 +1778,7 @@
         <w:rPr/>
         <w:t>,</w:t>
       </w:r>
-      <w:ins w:id="78" w:author="Workflow" w:date="2026-10-26T04:32:19Z">
+      <w:ins w:id="78" w:author="Workflow" w:date="2026-10-26T10:12:21Z">
         <w:r>
           <w:rPr/>
           <w:t xml:space="preserve"> insertion or deletion)</w:t>
@@ -1672,13 +1788,13 @@
         <w:rPr/>
         <w:t xml:space="preserve"> and cross-references </w:t>
       </w:r>
-      <w:del w:id="79" w:author="Workflow" w:date="2026-10-26T04:32:19Z">
+      <w:del w:id="79" w:author="Workflow" w:date="2026-10-26T10:12:21Z">
         <w:r>
           <w:rPr/>
           <w:delText>for</w:delText>
         </w:r>
       </w:del>
-      <w:ins w:id="80" w:author="Workflow" w:date="2026-10-26T04:32:19Z">
+      <w:ins w:id="80" w:author="Workflow" w:date="2026-10-26T10:12:21Z">
         <w:r>
           <w:rPr/>
           <w:t>(the</w:t>
@@ -1688,13 +1804,13 @@
         <w:rPr/>
         <w:t xml:space="preserve"> </w:t>
       </w:r>
-      <w:del w:id="81" w:author="Workflow" w:date="2026-10-26T04:32:19Z">
+      <w:del w:id="81" w:author="Workflow" w:date="2026-10-26T10:12:21Z">
         <w:r>
           <w:rPr/>
           <w:delText>each</w:delText>
         </w:r>
       </w:del>
-      <w:ins w:id="82" w:author="Workflow" w:date="2026-10-26T04:32:19Z">
+      <w:ins w:id="82" w:author="Workflow" w:date="2026-10-26T10:12:21Z">
         <w:r>
           <w:rPr/>
           <w:t>rsID and the sources that list the</w:t>
@@ -1711,7 +1827,7 @@
         </w:rPr>
         <w:commentReference w:id="89"/>
       </w:r>
-      <w:ins w:id="83" w:author="Workflow" w:date="2026-10-26T04:32:19Z">
+      <w:ins w:id="83" w:author="Workflow" w:date="2026-10-26T10:12:21Z">
         <w:r>
           <w:rPr/>
           <w:t>)</w:t>
@@ -1735,13 +1851,13 @@
         <w:t xml:space="preserve"> The database is cached locally as chromosome-level Parquet files, downloaded from HuggingFace </w:t>
       </w:r>
       <w:commentRangeStart w:id="16"/>
-      <w:del w:id="84" w:author="Workflow" w:date="2026-10-26T04:32:19Z">
+      <w:del w:id="84" w:author="Workflow" w:date="2026-10-26T10:12:21Z">
         <w:r>
           <w:rPr/>
           <w:delText>through</w:delText>
         </w:r>
       </w:del>
-      <w:ins w:id="85" w:author="Workflow" w:date="2026-10-26T04:32:19Z">
+      <w:ins w:id="85" w:author="Workflow" w:date="2026-10-26T10:12:21Z">
         <w:r>
           <w:rPr/>
           <w:t>and</w:t>
@@ -1751,7 +1867,7 @@
         <w:rPr/>
         <w:t xml:space="preserve"> </w:t>
       </w:r>
-      <w:del w:id="86" w:author="Workflow" w:date="2026-10-26T04:32:19Z">
+      <w:del w:id="86" w:author="Workflow" w:date="2026-10-26T10:12:21Z">
         <w:r>
           <w:rPr/>
           <w:delText>fsspec</w:delText>
@@ -1764,7 +1880,7 @@
         </w:rPr>
         <w:commentReference w:id="98"/>
       </w:r>
-      <w:ins w:id="87" w:author="Workflow" w:date="2026-10-26T04:32:19Z">
+      <w:ins w:id="87" w:author="Workflow" w:date="2026-10-26T10:12:21Z">
         <w:r>
           <w:rPr/>
           <w:t>checked against each file's published size and SHA-256</w:t>
@@ -1815,13 +1931,13 @@
         <w:t xml:space="preserve"> For variant-only </w:t>
       </w:r>
       <w:commentRangeStart w:id="17"/>
-      <w:del w:id="88" w:author="Prose edit" w:date="2026-10-26T04:32:19Z">
+      <w:del w:id="88" w:author="Prose edit" w:date="2026-10-26T10:12:21Z">
         <w:r>
           <w:rPr/>
           <w:delText>callsets</w:delText>
         </w:r>
       </w:del>
-      <w:ins w:id="89" w:author="Prose edit" w:date="2026-10-26T04:32:19Z">
+      <w:ins w:id="89" w:author="Prose edit" w:date="2026-10-26T10:12:21Z">
         <w:r>
           <w:rPr/>
           <w:t>call sets</w:t>
@@ -1855,13 +1971,13 @@
       </w:r>
       <w:commentRangeStart w:id="18"/>
       <w:commentRangeStart w:id="140"/>
-      <w:del w:id="90" w:author="Prose edit" w:date="2026-10-26T04:32:19Z">
+      <w:del w:id="90" w:author="Prose edit" w:date="2026-10-26T10:12:21Z">
         <w:r>
           <w:rPr/>
           <w:delText>Nearby</w:delText>
         </w:r>
       </w:del>
-      <w:ins w:id="91" w:author="Prose edit" w:date="2026-10-26T04:32:19Z">
+      <w:ins w:id="91" w:author="Prose edit" w:date="2026-10-26T10:12:21Z">
         <w:r>
           <w:rPr/>
           <w:t>A restored site must lie within a set distance of a called variant, and nearby</w:t>
@@ -1948,13 +2064,13 @@
     <w:p>
       <w:commentRangeStart w:id="19"/>
       <w:commentRangeStart w:id="169"/>
-      <w:del w:id="92" w:author="Story" w:date="2026-10-26T04:32:19Z">
+      <w:del w:id="92" w:author="Story" w:date="2026-10-26T10:12:21Z">
         <w:r>
           <w:rPr/>
           <w:delText xml:space="preserve">The </w:delText>
         </w:r>
       </w:del>
-      <w:del w:id="93" w:author="Story" w:date="2026-10-26T04:32:19Z">
+      <w:del w:id="93" w:author="Story" w:date="2026-10-26T10:12:21Z">
         <w:r>
           <w:rPr>
             <w:rFonts w:ascii="Consolas" w:hAnsi="Consolas"/>
@@ -1962,7 +2078,7 @@
           <w:delText>just-dna-format</w:delText>
         </w:r>
       </w:del>
-      <w:del w:id="94" w:author="Story" w:date="2026-10-26T04:32:19Z">
+      <w:del w:id="94" w:author="Story" w:date="2026-10-26T10:12:21Z">
         <w:r>
           <w:rPr/>
           <w:delText xml:space="preserve"> library defines the authored specification and the manifest, integrity and versioning contract of compiled artifacts.</w:delText>
@@ -1975,7 +2091,7 @@
         </w:rPr>
         <w:commentReference w:id="169"/>
       </w:r>
-      <w:del w:id="95" w:author="Story" w:date="2026-10-26T04:32:19Z">
+      <w:del w:id="95" w:author="Story" w:date="2026-10-26T10:12:21Z">
         <w:r>
           <w:rPr/>
           <w:delText xml:space="preserve"> Discovery reads a module's declared files from its manifest, or finds the tables directly in older Parquet modules that have none.</w:delText>
@@ -2043,7 +2159,7 @@
         <w:rPr/>
         <w:t xml:space="preserve"> CSV files are used only for authoring: at runtime the platform reads the compiled Parquet tables, so existing Parquet modules need no CSV files</w:t>
       </w:r>
-      <w:ins w:id="96" w:author="Story" w:date="2026-10-26T04:32:19Z">
+      <w:ins w:id="96" w:author="Story" w:date="2026-10-26T10:12:21Z">
         <w:r>
           <w:rPr/>
           <w:t>.</w:t>
@@ -2051,13 +2167,13 @@
       </w:ins>
     </w:p>
     <w:p>
-      <w:ins w:id="97" w:author="Story" w:date="2026-10-26T04:32:19Z">
+      <w:ins w:id="97" w:author="Story" w:date="2026-10-26T10:12:21Z">
         <w:r>
           <w:rPr/>
           <w:t xml:space="preserve">The </w:t>
         </w:r>
       </w:ins>
-      <w:ins w:id="98" w:author="Story" w:date="2026-10-26T04:32:19Z">
+      <w:ins w:id="98" w:author="Story" w:date="2026-10-26T10:12:21Z">
         <w:r>
           <w:rPr>
             <w:rFonts w:ascii="Consolas" w:hAnsi="Consolas"/>
@@ -2065,13 +2181,13 @@
           <w:t>just-dna-format</w:t>
         </w:r>
       </w:ins>
-      <w:ins w:id="99" w:author="Story" w:date="2026-10-26T04:32:19Z">
+      <w:ins w:id="99" w:author="Story" w:date="2026-10-26T10:12:21Z">
         <w:r>
           <w:rPr/>
           <w:t xml:space="preserve"> library defines the authored specification and the manifest, integrity and versioning contract of compiled artifacts.</w:t>
         </w:r>
       </w:ins>
-      <w:ins w:id="100" w:author="Story" w:date="2026-10-26T04:32:19Z">
+      <w:ins w:id="100" w:author="Story" w:date="2026-10-26T10:12:21Z">
         <w:r>
           <w:rPr/>
           <w:t xml:space="preserve"> Discovery reads a module's declared files from its manifest, or finds the tables directly in older Parquet modules that have none</w:t>
@@ -2132,13 +2248,13 @@
       </w:r>
       <w:commentRangeStart w:id="20"/>
       <w:commentRangeStart w:id="90"/>
-      <w:del w:id="101" w:author="Workflow" w:date="2026-10-26T04:32:19Z">
+      <w:del w:id="101" w:author="Workflow" w:date="2026-10-26T10:12:21Z">
         <w:r>
           <w:rPr/>
           <w:delText>Integrity</w:delText>
         </w:r>
       </w:del>
-      <w:ins w:id="102" w:author="Workflow" w:date="2026-10-26T04:32:19Z">
+      <w:ins w:id="102" w:author="Workflow" w:date="2026-10-26T10:12:21Z">
         <w:r>
           <w:rPr/>
           <w:t>The</w:t>
@@ -2148,13 +2264,13 @@
         <w:rPr/>
         <w:t xml:space="preserve"> </w:t>
       </w:r>
-      <w:del w:id="103" w:author="Workflow" w:date="2026-10-26T04:32:19Z">
+      <w:del w:id="103" w:author="Workflow" w:date="2026-10-26T10:12:21Z">
         <w:r>
           <w:rPr/>
           <w:delText>verification</w:delText>
         </w:r>
       </w:del>
-      <w:ins w:id="104" w:author="Workflow" w:date="2026-10-26T04:32:19Z">
+      <w:ins w:id="104" w:author="Workflow" w:date="2026-10-26T10:12:21Z">
         <w:r>
           <w:rPr/>
           <w:t>platform</w:t>
@@ -2164,13 +2280,13 @@
         <w:rPr/>
         <w:t xml:space="preserve"> </w:t>
       </w:r>
-      <w:del w:id="105" w:author="Workflow" w:date="2026-10-26T04:32:19Z">
+      <w:del w:id="105" w:author="Workflow" w:date="2026-10-26T10:12:21Z">
         <w:r>
           <w:rPr/>
           <w:delText>establishes</w:delText>
         </w:r>
       </w:del>
-      <w:ins w:id="106" w:author="Workflow" w:date="2026-10-26T04:32:19Z">
+      <w:ins w:id="106" w:author="Workflow" w:date="2026-10-26T10:12:21Z">
         <w:r>
           <w:rPr/>
           <w:t>records the digest each module states but does not yet recompute it when it discovers or installs a module; such a check would establish</w:t>
@@ -2213,13 +2329,13 @@
       </w:r>
       <w:commentRangeStart w:id="21"/>
       <w:commentRangeStart w:id="97"/>
-      <w:del w:id="107" w:author="Workflow" w:date="2026-10-26T04:32:19Z">
+      <w:del w:id="107" w:author="Workflow" w:date="2026-10-26T10:12:21Z">
         <w:r>
           <w:rPr/>
           <w:delText>an</w:delText>
         </w:r>
       </w:del>
-      <w:ins w:id="108" w:author="Workflow" w:date="2026-10-26T04:32:19Z">
+      <w:ins w:id="108" w:author="Workflow" w:date="2026-10-26T10:12:21Z">
         <w:r>
           <w:rPr/>
           <w:t>one</w:t>
@@ -2229,7 +2345,7 @@
         <w:rPr/>
         <w:t xml:space="preserve"> HTML report per</w:t>
       </w:r>
-      <w:ins w:id="109" w:author="Workflow" w:date="2026-10-26T04:32:19Z">
+      <w:ins w:id="109" w:author="Workflow" w:date="2026-10-26T10:12:21Z">
         <w:r>
           <w:rPr/>
           <w:t xml:space="preserve"> run, with a section for each selected</w:t>
@@ -2254,7 +2370,7 @@
         <w:commentReference w:id="97"/>
       </w:r>
       <w:commentRangeStart w:id="22"/>
-      <w:ins w:id="110" w:author="Workflow" w:date="2026-10-26T04:32:19Z">
+      <w:ins w:id="110" w:author="Workflow" w:date="2026-10-26T10:12:21Z">
         <w:r>
           <w:rPr/>
           <w:t xml:space="preserve"> (Figure 1)</w:t>
@@ -2276,7 +2392,7 @@
         <w:t xml:space="preserve"> Users can browse the full variant table with sorting, filtering, and search, cross-referenced against Ensembl for clinical </w:t>
       </w:r>
       <w:commentRangeStart w:id="23"/>
-      <w:ins w:id="111" w:author="Workflow" w:date="2026-10-26T04:32:19Z">
+      <w:ins w:id="111" w:author="Workflow" w:date="2026-10-26T10:12:21Z">
         <w:r>
           <w:rPr/>
           <w:t>-</w:t>
@@ -2286,13 +2402,13 @@
         <w:rPr/>
         <w:t xml:space="preserve">significance </w:t>
       </w:r>
-      <w:del w:id="112" w:author="Workflow" w:date="2026-10-26T04:32:19Z">
+      <w:del w:id="112" w:author="Workflow" w:date="2026-10-26T10:12:21Z">
         <w:r>
           <w:rPr/>
           <w:delText>labels</w:delText>
         </w:r>
       </w:del>
-      <w:ins w:id="113" w:author="Workflow" w:date="2026-10-26T04:32:19Z">
+      <w:ins w:id="113" w:author="Workflow" w:date="2026-10-26T10:12:21Z">
         <w:r>
           <w:rPr/>
           <w:t>flags</w:t>
@@ -2302,13 +2418,13 @@
         <w:rPr/>
         <w:t xml:space="preserve">, </w:t>
       </w:r>
-      <w:del w:id="114" w:author="Workflow" w:date="2026-10-26T04:32:19Z">
+      <w:del w:id="114" w:author="Workflow" w:date="2026-10-26T10:12:21Z">
         <w:r>
           <w:rPr/>
           <w:delText>consequence</w:delText>
         </w:r>
       </w:del>
-      <w:ins w:id="115" w:author="Workflow" w:date="2026-10-26T04:32:19Z">
+      <w:ins w:id="115" w:author="Workflow" w:date="2026-10-26T10:12:21Z">
         <w:r>
           <w:rPr/>
           <w:t>the</w:t>
@@ -2318,13 +2434,13 @@
         <w:rPr/>
         <w:t xml:space="preserve"> </w:t>
       </w:r>
-      <w:del w:id="116" w:author="Workflow" w:date="2026-10-26T04:32:19Z">
+      <w:del w:id="116" w:author="Workflow" w:date="2026-10-26T10:12:21Z">
         <w:r>
           <w:rPr/>
           <w:delText>types,</w:delText>
         </w:r>
       </w:del>
-      <w:ins w:id="117" w:author="Workflow" w:date="2026-10-26T04:32:19Z">
+      <w:ins w:id="117" w:author="Workflow" w:date="2026-10-26T10:12:21Z">
         <w:r>
           <w:rPr/>
           <w:t>variant class</w:t>
@@ -2334,13 +2450,13 @@
         <w:rPr/>
         <w:t xml:space="preserve"> and </w:t>
       </w:r>
-      <w:del w:id="118" w:author="Workflow" w:date="2026-10-26T04:32:19Z">
+      <w:del w:id="118" w:author="Workflow" w:date="2026-10-26T10:12:21Z">
         <w:r>
           <w:rPr/>
           <w:delText>known</w:delText>
         </w:r>
       </w:del>
-      <w:ins w:id="119" w:author="Workflow" w:date="2026-10-26T04:32:19Z">
+      <w:ins w:id="119" w:author="Workflow" w:date="2026-10-26T10:12:21Z">
         <w:r>
           <w:rPr/>
           <w:t>whether a</w:t>
@@ -2350,13 +2466,13 @@
         <w:rPr/>
         <w:t xml:space="preserve"> phenotype </w:t>
       </w:r>
-      <w:del w:id="120" w:author="Workflow" w:date="2026-10-26T04:32:19Z">
+      <w:del w:id="120" w:author="Workflow" w:date="2026-10-26T10:12:21Z">
         <w:r>
           <w:rPr/>
           <w:delText>associations</w:delText>
         </w:r>
       </w:del>
-      <w:ins w:id="121" w:author="Workflow" w:date="2026-10-26T04:32:19Z">
+      <w:ins w:id="121" w:author="Workflow" w:date="2026-10-26T10:12:21Z">
         <w:r>
           <w:rPr/>
           <w:t>or disease association is recorded</w:t>
@@ -2524,7 +2640,7 @@
       </w:r>
       <w:commentRangeStart w:id="24"/>
       <w:commentRangeStart w:id="78"/>
-      <w:del w:id="122" w:author="Deslop" w:date="2026-10-26T04:32:19Z">
+      <w:del w:id="122" w:author="Deslop" w:date="2026-10-26T10:12:21Z">
         <w:r>
           <w:rPr/>
           <w:delText>; here they provide concrete examples of what the extensible annotation system can report</w:delText>
@@ -3015,7 +3131,7 @@
         <w:commentReference w:id="104"/>
       </w:r>
       <w:commentRangeStart w:id="25"/>
-      <w:ins w:id="123" w:author="Workflow" w:date="2026-10-26T04:32:19Z">
+      <w:ins w:id="123" w:author="Workflow" w:date="2026-10-26T10:12:21Z">
         <w:r>
           <w:rPr/>
           <w:t>; the module keeps those with significant associations (Table S4)</w:t>
@@ -3110,7 +3226,7 @@
         <w:t xml:space="preserve">_genotype) captures the direction and magnitude of the reported association for a specific genotype: 0 for </w:t>
       </w:r>
       <w:commentRangeStart w:id="26"/>
-      <w:ins w:id="124" w:author="Workflow" w:date="2026-10-26T04:32:19Z">
+      <w:ins w:id="124" w:author="Workflow" w:date="2026-10-26T10:12:21Z">
         <w:r>
           <w:rPr/>
           <w:t xml:space="preserve">a genotype without </w:t>
@@ -3120,13 +3236,13 @@
         <w:rPr/>
         <w:t xml:space="preserve">the </w:t>
       </w:r>
-      <w:del w:id="125" w:author="Workflow" w:date="2026-10-26T04:32:19Z">
+      <w:del w:id="125" w:author="Workflow" w:date="2026-10-26T10:12:21Z">
         <w:r>
           <w:rPr/>
           <w:delText>reference</w:delText>
         </w:r>
       </w:del>
-      <w:ins w:id="126" w:author="Workflow" w:date="2026-10-26T04:32:19Z">
+      <w:ins w:id="126" w:author="Workflow" w:date="2026-10-26T10:12:21Z">
         <w:r>
           <w:rPr/>
           <w:t>associated</w:t>
@@ -3136,13 +3252,13 @@
         <w:rPr/>
         <w:t xml:space="preserve"> </w:t>
       </w:r>
-      <w:del w:id="127" w:author="Workflow" w:date="2026-10-26T04:32:19Z">
+      <w:del w:id="127" w:author="Workflow" w:date="2026-10-26T10:12:21Z">
         <w:r>
           <w:rPr/>
           <w:delText>genotype</w:delText>
         </w:r>
       </w:del>
-      <w:ins w:id="128" w:author="Workflow" w:date="2026-10-26T04:32:19Z">
+      <w:ins w:id="128" w:author="Workflow" w:date="2026-10-26T10:12:21Z">
         <w:r>
           <w:rPr/>
           <w:t>allele</w:t>
@@ -3152,7 +3268,7 @@
         <w:rPr/>
         <w:t>,</w:t>
       </w:r>
-      <w:ins w:id="129" w:author="Workflow" w:date="2026-10-26T04:32:19Z">
+      <w:ins w:id="129" w:author="Workflow" w:date="2026-10-26T10:12:21Z">
         <w:r>
           <w:rPr/>
           <w:t xml:space="preserve"> and</w:t>
@@ -3169,13 +3285,13 @@
         </w:rPr>
         <w:commentReference w:id="120"/>
       </w:r>
-      <w:ins w:id="130" w:author="Workflow" w:date="2026-10-26T04:32:19Z">
+      <w:ins w:id="130" w:author="Workflow" w:date="2026-10-26T10:12:21Z">
         <w:r>
           <w:rPr/>
           <w:t>.</w:t>
         </w:r>
       </w:ins>
-      <w:ins w:id="131" w:author="Workflow" w:date="2026-10-26T04:32:19Z">
+      <w:ins w:id="131" w:author="Workflow" w:date="2026-10-26T10:12:21Z">
         <w:r>
           <w:rPr/>
           <w:t xml:space="preserve"> The associated allele can be the reference allele, as for FOXO3 rs2802292 below</w:t>
@@ -3211,7 +3327,7 @@
       </w:r>
       <w:commentRangeStart w:id="27"/>
       <w:commentRangeStart w:id="28"/>
-      <w:ins w:id="132" w:author="Story" w:date="2026-10-26T04:32:19Z">
+      <w:ins w:id="132" w:author="Story" w:date="2026-10-26T10:12:21Z">
         <w:r>
           <w:rPr/>
           <w:t>, one copy of the reference G allele that the module associates with longevity,</w:t>
@@ -3248,13 +3364,13 @@
         <w:t xml:space="preserve"> The expanded row </w:t>
       </w:r>
       <w:commentRangeStart w:id="29"/>
-      <w:del w:id="133" w:author="Workflow" w:date="2026-10-26T04:32:19Z">
+      <w:del w:id="133" w:author="Workflow" w:date="2026-10-26T10:12:21Z">
         <w:r>
           <w:rPr/>
           <w:delText>contains</w:delText>
         </w:r>
       </w:del>
-      <w:ins w:id="134" w:author="Workflow" w:date="2026-10-26T04:32:19Z">
+      <w:ins w:id="134" w:author="Workflow" w:date="2026-10-26T10:12:21Z">
         <w:r>
           <w:rPr/>
           <w:t>shows</w:t>
@@ -3264,13 +3380,13 @@
         <w:rPr/>
         <w:t xml:space="preserve"> the genotype</w:t>
       </w:r>
-      <w:del w:id="135" w:author="Workflow" w:date="2026-10-26T04:32:19Z">
+      <w:del w:id="135" w:author="Workflow" w:date="2026-10-26T10:12:21Z">
         <w:r>
           <w:rPr/>
           <w:delText>-specific</w:delText>
         </w:r>
       </w:del>
-      <w:ins w:id="136" w:author="Workflow" w:date="2026-10-26T04:32:19Z">
+      <w:ins w:id="136" w:author="Workflow" w:date="2026-10-26T10:12:21Z">
         <w:r>
           <w:rPr/>
           <w:t>'s</w:t>
@@ -3280,13 +3396,13 @@
         <w:rPr/>
         <w:t xml:space="preserve"> </w:t>
       </w:r>
-      <w:del w:id="137" w:author="Workflow" w:date="2026-10-26T04:32:19Z">
+      <w:del w:id="137" w:author="Workflow" w:date="2026-10-26T10:12:21Z">
         <w:r>
           <w:rPr/>
           <w:delText>annotation</w:delText>
         </w:r>
       </w:del>
-      <w:ins w:id="138" w:author="Workflow" w:date="2026-10-26T04:32:19Z">
+      <w:ins w:id="138" w:author="Workflow" w:date="2026-10-26T10:12:21Z">
         <w:r>
           <w:rPr/>
           <w:t>direction (Protective) and weight, the module's stored conclusion</w:t>
@@ -3431,7 +3547,7 @@
         <w:t xml:space="preserve">Polygenic risk scores (PRS) aggregate the effects of many </w:t>
       </w:r>
       <w:commentRangeStart w:id="30"/>
-      <w:del w:id="139" w:author="Reference check" w:date="2026-10-26T04:32:19Z">
+      <w:del w:id="139" w:author="Reference check" w:date="2026-10-26T10:12:21Z">
         <w:r>
           <w:rPr/>
           <w:delText xml:space="preserve">common </w:delText>
@@ -3441,7 +3557,7 @@
         <w:rPr/>
         <w:t>variants into a single weighted sum</w:t>
       </w:r>
-      <w:del w:id="140" w:author="Reference check" w:date="2026-10-26T04:32:19Z">
+      <w:del w:id="140" w:author="Reference check" w:date="2026-10-26T10:12:21Z">
         <w:r>
           <w:rPr/>
           <w:delText>, providing a population-relative measure for a given trait</w:delText>
@@ -3458,7 +3574,7 @@
         <w:rPr/>
         <w:t xml:space="preserve"> (Lambert et al., 2021)</w:t>
       </w:r>
-      <w:ins w:id="141" w:author="Reference check" w:date="2026-10-26T04:32:19Z">
+      <w:ins w:id="141" w:author="Reference check" w:date="2026-10-26T10:12:21Z">
         <w:r>
           <w:rPr/>
           <w:t>, which is read as a position within a reference population for a given trait</w:t>
@@ -3486,7 +3602,7 @@
       </w:r>
       <w:commentRangeStart w:id="31"/>
       <w:commentRangeStart w:id="32"/>
-      <w:ins w:id="142" w:author="Reference check" w:date="2026-10-26T04:32:19Z">
+      <w:ins w:id="142" w:author="Reference check" w:date="2026-10-26T10:12:21Z">
         <w:r>
           <w:rPr/>
           <w:t>; harmonized files documented at https://www.pgscatalog.org/downloads/</w:t>
@@ -3541,7 +3657,7 @@
       </w:r>
       <w:commentRangeStart w:id="33"/>
       <w:commentRangeStart w:id="34"/>
-      <w:ins w:id="143" w:author="Reference check" w:date="2026-10-26T04:32:19Z">
+      <w:ins w:id="143" w:author="Reference check" w:date="2026-10-26T10:12:21Z">
         <w:r>
           <w:rPr/>
           <w:t xml:space="preserve"> (Kulaga et al., 2024)</w:t>
@@ -3664,7 +3780,7 @@
         <w:t xml:space="preserve">For consumer arrays (23andMe, AncestryDNA), </w:t>
       </w:r>
       <w:commentRangeStart w:id="35"/>
-      <w:ins w:id="144" w:author="Workflow" w:date="2026-10-26T04:32:19Z">
+      <w:ins w:id="144" w:author="Workflow" w:date="2026-10-26T10:12:21Z">
         <w:r>
           <w:rPr/>
           <w:t xml:space="preserve">which, as of October 2026, the just-prs library reads but the platform's web upload does not (Section 5.4), </w:t>
@@ -3752,7 +3868,7 @@
         <w:t xml:space="preserve"> Multiple PGS Catalog models for one trait are displayed together, with model identifiers, percentile markers and variant </w:t>
       </w:r>
       <w:commentRangeStart w:id="36"/>
-      <w:ins w:id="145" w:author="Prose edit" w:date="2026-10-26T04:32:19Z">
+      <w:ins w:id="145" w:author="Prose edit" w:date="2026-10-26T10:12:21Z">
         <w:r>
           <w:rPr/>
           <w:t>-</w:t>
@@ -3873,13 +3989,13 @@
         <w:commentReference w:id="125"/>
       </w:r>
       <w:commentRangeStart w:id="37"/>
-      <w:del w:id="146" w:author="Prose edit" w:date="2026-10-26T04:32:19Z">
+      <w:del w:id="146" w:author="Prose edit" w:date="2026-10-26T10:12:21Z">
         <w:r>
           <w:rPr/>
           <w:delText>amongst</w:delText>
         </w:r>
       </w:del>
-      <w:ins w:id="147" w:author="Prose edit" w:date="2026-10-26T04:32:19Z">
+      <w:ins w:id="147" w:author="Prose edit" w:date="2026-10-26T10:12:21Z">
         <w:r>
           <w:rPr/>
           <w:t>among</w:t>
@@ -3906,13 +4022,13 @@
       </w:r>
       <w:commentRangeStart w:id="38"/>
       <w:commentRangeStart w:id="141"/>
-      <w:del w:id="148" w:author="Prose edit" w:date="2026-10-26T04:32:19Z">
+      <w:del w:id="148" w:author="Prose edit" w:date="2026-10-26T10:12:21Z">
         <w:r>
           <w:rPr/>
           <w:delText>The</w:delText>
         </w:r>
       </w:del>
-      <w:ins w:id="149" w:author="Prose edit" w:date="2026-10-26T04:32:19Z">
+      <w:ins w:id="149" w:author="Prose edit" w:date="2026-10-26T10:12:21Z">
         <w:r>
           <w:rPr/>
           <w:t>Both</w:t>
@@ -3922,13 +4038,13 @@
         <w:rPr/>
         <w:t xml:space="preserve"> </w:t>
       </w:r>
-      <w:del w:id="150" w:author="Prose edit" w:date="2026-10-26T04:32:19Z">
+      <w:del w:id="150" w:author="Prose edit" w:date="2026-10-26T10:12:21Z">
         <w:r>
           <w:rPr/>
           <w:delText>server</w:delText>
         </w:r>
       </w:del>
-      <w:ins w:id="151" w:author="Prose edit" w:date="2026-10-26T04:32:19Z">
+      <w:ins w:id="151" w:author="Prose edit" w:date="2026-10-26T10:12:21Z">
         <w:r>
           <w:rPr/>
           <w:t>servers</w:t>
@@ -3938,13 +4054,13 @@
         <w:rPr/>
         <w:t xml:space="preserve"> </w:t>
       </w:r>
-      <w:del w:id="152" w:author="Prose edit" w:date="2026-10-26T04:32:19Z">
+      <w:del w:id="152" w:author="Prose edit" w:date="2026-10-26T10:12:21Z">
         <w:r>
           <w:rPr/>
           <w:delText>runs</w:delText>
         </w:r>
       </w:del>
-      <w:ins w:id="153" w:author="Prose edit" w:date="2026-10-26T04:32:19Z">
+      <w:ins w:id="153" w:author="Prose edit" w:date="2026-10-26T10:12:21Z">
         <w:r>
           <w:rPr/>
           <w:t>run</w:t>
@@ -3980,13 +4096,13 @@
         <w:t xml:space="preserve">All these interfaces </w:t>
       </w:r>
       <w:commentRangeStart w:id="39"/>
-      <w:del w:id="154" w:author="Workflow" w:date="2026-10-26T04:32:19Z">
+      <w:del w:id="154" w:author="Workflow" w:date="2026-10-26T10:12:21Z">
         <w:r>
           <w:rPr/>
           <w:delText>share</w:delText>
         </w:r>
       </w:del>
-      <w:ins w:id="155" w:author="Workflow" w:date="2026-10-26T04:32:19Z">
+      <w:ins w:id="155" w:author="Workflow" w:date="2026-10-26T10:12:21Z">
         <w:r>
           <w:rPr/>
           <w:t>call</w:t>
@@ -3996,13 +4112,13 @@
         <w:rPr/>
         <w:t xml:space="preserve"> one scoring implementation, </w:t>
       </w:r>
-      <w:del w:id="156" w:author="Workflow" w:date="2026-10-26T04:32:19Z">
+      <w:del w:id="156" w:author="Workflow" w:date="2026-10-26T10:12:21Z">
         <w:r>
           <w:rPr/>
           <w:delText>and</w:delText>
         </w:r>
       </w:del>
-      <w:ins w:id="157" w:author="Workflow" w:date="2026-10-26T04:32:19Z">
+      <w:ins w:id="157" w:author="Workflow" w:date="2026-10-26T10:12:21Z">
         <w:r>
           <w:rPr/>
           <w:t>so</w:t>
@@ -4013,7 +4129,7 @@
         <w:rPr/>
         <w:t xml:space="preserve"> equivalent inputs, reference data and settings </w:t>
       </w:r>
-      <w:ins w:id="158" w:author="Workflow" w:date="2026-10-26T04:32:19Z">
+      <w:ins w:id="158" w:author="Workflow" w:date="2026-10-26T10:12:21Z">
         <w:r>
           <w:rPr/>
           <w:t xml:space="preserve">should </w:t>
@@ -4037,7 +4153,7 @@
         </w:rPr>
         <w:commentReference w:id="99"/>
       </w:r>
-      <w:ins w:id="159" w:author="Workflow" w:date="2026-10-26T04:32:19Z">
+      <w:ins w:id="159" w:author="Workflow" w:date="2026-10-26T10:12:21Z">
         <w:r>
           <w:rPr/>
           <w:t xml:space="preserve"> with the same just-prs version</w:t>
@@ -4051,13 +4167,13 @@
         <w:commentReference w:id="39"/>
       </w:r>
       <w:commentRangeStart w:id="40"/>
-      <w:del w:id="160" w:author="Story" w:date="2026-10-26T04:32:19Z">
+      <w:del w:id="160" w:author="Story" w:date="2026-10-26T10:12:21Z">
         <w:r>
           <w:rPr/>
           <w:delText>;</w:delText>
         </w:r>
       </w:del>
-      <w:ins w:id="161" w:author="Story" w:date="2026-10-26T04:32:19Z">
+      <w:ins w:id="161" w:author="Story" w:date="2026-10-26T10:12:21Z">
         <w:r>
           <w:rPr/>
           <w:t>.</w:t>
@@ -4067,13 +4183,13 @@
         <w:rPr/>
         <w:t xml:space="preserve"> </w:t>
       </w:r>
-      <w:del w:id="162" w:author="Story" w:date="2026-10-26T04:32:19Z">
+      <w:del w:id="162" w:author="Story" w:date="2026-10-26T10:12:21Z">
         <w:r>
           <w:rPr/>
           <w:delText>the</w:delText>
         </w:r>
       </w:del>
-      <w:ins w:id="163" w:author="Story" w:date="2026-10-26T04:32:19Z">
+      <w:ins w:id="163" w:author="Story" w:date="2026-10-26T10:12:21Z">
         <w:r>
           <w:rPr/>
           <w:t>The</w:t>
@@ -4108,13 +4224,13 @@
         <w:t>The reference superpopulation is chosen by a k-nearest-neighbour classifier on principal components, built once from the 1000 Genomes high-coverage panel (Byrska-Bishop et al., 2022) and downloaded as a fixed model</w:t>
       </w:r>
       <w:commentRangeStart w:id="41"/>
-      <w:ins w:id="164" w:author="Workflow" w:date="2026-10-26T04:32:19Z">
+      <w:ins w:id="164" w:author="Workflow" w:date="2026-10-26T10:12:21Z">
         <w:r>
           <w:rPr/>
           <w:t xml:space="preserve"> (HuggingFace dataset </w:t>
         </w:r>
       </w:ins>
-      <w:ins w:id="165" w:author="Workflow" w:date="2026-10-26T04:32:19Z">
+      <w:ins w:id="165" w:author="Workflow" w:date="2026-10-26T10:12:21Z">
         <w:r>
           <w:rPr>
             <w:rFonts w:ascii="Consolas" w:hAnsi="Consolas"/>
@@ -4122,13 +4238,13 @@
           <w:t>just-dna-seq/pgs-catalog</w:t>
         </w:r>
       </w:ins>
-      <w:ins w:id="166" w:author="Workflow" w:date="2026-10-26T04:32:19Z">
+      <w:ins w:id="166" w:author="Workflow" w:date="2026-10-26T10:12:21Z">
         <w:r>
           <w:rPr/>
           <w:t xml:space="preserve">, folder </w:t>
         </w:r>
       </w:ins>
-      <w:ins w:id="167" w:author="Workflow" w:date="2026-10-26T04:32:19Z">
+      <w:ins w:id="167" w:author="Workflow" w:date="2026-10-26T10:12:21Z">
         <w:r>
           <w:rPr>
             <w:rFonts w:ascii="Consolas" w:hAnsi="Consolas"/>
@@ -4136,7 +4252,7 @@
           <w:t>data/ancestry</w:t>
         </w:r>
       </w:ins>
-      <w:ins w:id="168" w:author="Workflow" w:date="2026-10-26T04:32:19Z">
+      <w:ins w:id="168" w:author="Workflow" w:date="2026-10-26T10:12:21Z">
         <w:r>
           <w:rPr/>
           <w:t>)</w:t>
@@ -4186,7 +4302,7 @@
         <w:t xml:space="preserve"> A user's genome is projected into it with the online augmentation, decomposition and Procrustes method of FRAPOSA (Zhang et al., 2020), and its superpopulation is the majority among its 20 nearest reference individuals on the first 10 components.</w:t>
       </w:r>
       <w:commentRangeStart w:id="42"/>
-      <w:ins w:id="169" w:author="Workflow" w:date="2026-10-26T04:32:19Z">
+      <w:ins w:id="169" w:author="Workflow" w:date="2026-10-26T10:12:21Z">
         <w:r>
           <w:rPr/>
           <w:t xml:space="preserve"> Model sites a variant-only VCF does not list are coded as homozygous reference, and sites whose alleles disagree with the model as missing.</w:t>
@@ -4211,7 +4327,7 @@
       </w:r>
       <w:commentRangeStart w:id="43"/>
       <w:commentRangeStart w:id="44"/>
-      <w:ins w:id="170" w:author="Reporting check" w:date="2026-10-26T04:32:19Z">
+      <w:ins w:id="170" w:author="Reporting check" w:date="2026-10-26T10:12:21Z">
         <w:r>
           <w:rPr/>
           <w:t xml:space="preserve">on principal components computed from the whole panel, </w:t>
@@ -4221,7 +4337,7 @@
         <w:rPr/>
         <w:t>99.65% are assigned their own superpopulation</w:t>
       </w:r>
-      <w:ins w:id="171" w:author="Reporting check" w:date="2026-10-26T04:32:19Z">
+      <w:ins w:id="171" w:author="Reporting check" w:date="2026-10-26T10:12:21Z">
         <w:r>
           <w:rPr/>
           <w:t xml:space="preserve"> (2,566 of 2,575); seven of the nine misassigned individuals belong to the admixed American group, of whom 344 of 351 are assigned correctly</w:t>
@@ -4336,7 +4452,7 @@
         <w:t xml:space="preserve"> Modules can be drafted in such an assistant through the just-module-creator plugin (github.com/dna-seq/just-module-creator); the result is the same </w:t>
       </w:r>
       <w:commentRangeStart w:id="45"/>
-      <w:ins w:id="172" w:author="Prose edit" w:date="2026-10-26T04:32:19Z">
+      <w:ins w:id="172" w:author="Prose edit" w:date="2026-10-26T10:12:21Z">
         <w:r>
           <w:rPr/>
           <w:t xml:space="preserve">kind of </w:t>
@@ -4354,13 +4470,13 @@
         <w:t>artifact, validated and compiled the same way</w:t>
       </w:r>
       <w:commentRangeStart w:id="46"/>
-      <w:del w:id="173" w:author="Story" w:date="2026-10-26T04:32:19Z">
+      <w:del w:id="173" w:author="Story" w:date="2026-10-26T10:12:21Z">
         <w:r>
           <w:rPr/>
           <w:delText>,</w:delText>
         </w:r>
       </w:del>
-      <w:ins w:id="174" w:author="Story" w:date="2026-10-26T04:32:19Z">
+      <w:ins w:id="174" w:author="Story" w:date="2026-10-26T10:12:21Z">
         <w:r>
           <w:rPr/>
           <w:t>.</w:t>
@@ -4371,13 +4487,13 @@
         <w:t xml:space="preserve"> </w:t>
       </w:r>
       <w:commentRangeStart w:id="91"/>
-      <w:del w:id="175" w:author="Story" w:date="2026-10-26T04:32:19Z">
+      <w:del w:id="175" w:author="Story" w:date="2026-10-26T10:12:21Z">
         <w:r>
           <w:rPr/>
           <w:delText>and its</w:delText>
         </w:r>
       </w:del>
-      <w:ins w:id="176" w:author="Story" w:date="2026-10-26T04:32:19Z">
+      <w:ins w:id="176" w:author="Story" w:date="2026-10-26T10:12:21Z">
         <w:r>
           <w:rPr/>
           <w:t>Its</w:t>
@@ -4395,13 +4511,13 @@
         <w:t xml:space="preserve"> </w:t>
       </w:r>
       <w:commentRangeStart w:id="47"/>
-      <w:del w:id="177" w:author="Workflow" w:date="2026-10-26T04:32:19Z">
+      <w:del w:id="177" w:author="Workflow" w:date="2026-10-26T10:12:21Z">
         <w:r>
           <w:rPr/>
           <w:delText>curator</w:delText>
         </w:r>
       </w:del>
-      <w:ins w:id="178" w:author="Workflow" w:date="2026-10-26T04:32:19Z">
+      <w:ins w:id="178" w:author="Workflow" w:date="2026-10-26T10:12:21Z">
         <w:r>
           <w:rPr/>
           <w:t>manifest</w:t>
@@ -4411,13 +4527,13 @@
         <w:rPr/>
         <w:t xml:space="preserve"> </w:t>
       </w:r>
-      <w:del w:id="179" w:author="Workflow" w:date="2026-10-26T04:32:19Z">
+      <w:del w:id="179" w:author="Workflow" w:date="2026-10-26T10:12:21Z">
         <w:r>
           <w:rPr/>
           <w:delText>field</w:delText>
         </w:r>
       </w:del>
-      <w:ins w:id="180" w:author="Workflow" w:date="2026-10-26T04:32:19Z">
+      <w:ins w:id="180" w:author="Workflow" w:date="2026-10-26T10:12:21Z">
         <w:r>
           <w:rPr/>
           <w:t>can</w:t>
@@ -4427,13 +4543,13 @@
         <w:rPr/>
         <w:t xml:space="preserve"> </w:t>
       </w:r>
-      <w:del w:id="181" w:author="Workflow" w:date="2026-10-26T04:32:19Z">
+      <w:del w:id="181" w:author="Workflow" w:date="2026-10-26T10:12:21Z">
         <w:r>
           <w:rPr/>
           <w:delText>marks</w:delText>
         </w:r>
       </w:del>
-      <w:ins w:id="182" w:author="Workflow" w:date="2026-10-26T04:32:19Z">
+      <w:ins w:id="182" w:author="Workflow" w:date="2026-10-26T10:12:21Z">
         <w:r>
           <w:rPr/>
           <w:t>mark</w:t>
@@ -4450,7 +4566,7 @@
         </w:rPr>
         <w:commentReference w:id="91"/>
       </w:r>
-      <w:ins w:id="183" w:author="Workflow" w:date="2026-10-26T04:32:19Z">
+      <w:ins w:id="183" w:author="Workflow" w:date="2026-10-26T10:12:21Z">
         <w:r>
           <w:rPr/>
           <w:t xml:space="preserve"> through its authorship entries, which tag each contributor as human or AI</w:t>
@@ -4515,7 +4631,7 @@
         <w:t xml:space="preserve">On Anton Kulaga's published call set, the median full </w:t>
       </w:r>
       <w:commentRangeStart w:id="48"/>
-      <w:ins w:id="184" w:author="Prose edit" w:date="2026-10-26T04:32:19Z">
+      <w:ins w:id="184" w:author="Prose edit" w:date="2026-10-26T10:12:21Z">
         <w:r>
           <w:rPr/>
           <w:t xml:space="preserve">Generation II </w:t>
@@ -4548,13 +4664,13 @@
         <w:commentReference w:id="88"/>
       </w:r>
       <w:commentRangeStart w:id="49"/>
-      <w:ins w:id="185" w:author="Workflow" w:date="2026-10-26T04:32:19Z">
+      <w:ins w:id="185" w:author="Workflow" w:date="2026-10-26T10:12:21Z">
         <w:r>
           <w:rPr/>
           <w:t xml:space="preserve"> (Table 2).</w:t>
         </w:r>
       </w:ins>
-      <w:ins w:id="186" w:author="Workflow" w:date="2026-10-26T04:32:19Z">
+      <w:ins w:id="186" w:author="Workflow" w:date="2026-10-26T10:12:21Z">
         <w:r>
           <w:rPr/>
           <w:t xml:space="preserve"> Most Generation I runs on the other two call sets were made with the desktop in light use (Supplementary S2)</w:t>
@@ -4576,13 +4692,13 @@
         </w:rPr>
         <w:commentReference w:id="170"/>
       </w:r>
-      <w:del w:id="187" w:author="Workflow" w:date="2026-10-26T04:32:19Z">
+      <w:del w:id="187" w:author="Workflow" w:date="2026-10-26T10:12:21Z">
         <w:r>
           <w:rPr/>
           <w:delText>:</w:delText>
         </w:r>
       </w:del>
-      <w:ins w:id="188" w:author="Workflow" w:date="2026-10-26T04:32:19Z">
+      <w:ins w:id="188" w:author="Workflow" w:date="2026-10-26T10:12:21Z">
         <w:r>
           <w:rPr/>
           <w:t>.</w:t>
@@ -4600,7 +4716,7 @@
         </w:rPr>
         <w:commentReference w:id="102"/>
       </w:r>
-      <w:ins w:id="189" w:author="Workflow" w:date="2026-10-26T04:32:19Z">
+      <w:ins w:id="189" w:author="Workflow" w:date="2026-10-26T10:12:21Z">
         <w:r>
           <w:rPr/>
           <w:t xml:space="preserve"> (two runs each; 24- to 57-fold across pairs of runs)</w:t>
@@ -4619,7 +4735,7 @@
         <w:rPr/>
         <w:t xml:space="preserve"> A warm run took </w:t>
       </w:r>
-      <w:ins w:id="190" w:author="Workflow" w:date="2026-10-26T04:32:19Z">
+      <w:ins w:id="190" w:author="Workflow" w:date="2026-10-26T10:12:21Z">
         <w:r>
           <w:rPr/>
           <w:t xml:space="preserve">a median of </w:t>
@@ -4680,7 +4796,7 @@
         <w:t xml:space="preserve"> With Ensembl annotation on, peak memory was 5,568 to 5,750 MB</w:t>
       </w:r>
       <w:commentRangeStart w:id="50"/>
-      <w:ins w:id="191" w:author="Workflow" w:date="2026-10-26T04:32:19Z">
+      <w:ins w:id="191" w:author="Workflow" w:date="2026-10-26T10:12:21Z">
         <w:r>
           <w:rPr/>
           <w:t xml:space="preserve"> over all four such runs: the two Table 2 reports, a run on the first night and the second day's warm-up</w:t>
@@ -4720,7 +4836,7 @@
         <w:t xml:space="preserve"> Three more inputs vary the caller and the size: Livia Zaharia's public genome, called with DRAGEN (Behera et al., 2024; Zenodo record 19487816, CC</w:t>
       </w:r>
       <w:commentRangeStart w:id="51"/>
-      <w:del w:id="192" w:author="Prose edit" w:date="2026-10-26T04:32:19Z">
+      <w:del w:id="192" w:author="Prose edit" w:date="2026-10-26T10:12:21Z">
         <w:r>
           <w:rPr/>
           <w:delText>-</w:delText>
@@ -4730,7 +4846,7 @@
         <w:rPr/>
         <w:t xml:space="preserve"> BY</w:t>
       </w:r>
-      <w:del w:id="193" w:author="Prose edit" w:date="2026-10-26T04:32:19Z">
+      <w:del w:id="193" w:author="Prose edit" w:date="2026-10-26T10:12:21Z">
         <w:r>
           <w:rPr/>
           <w:delText>-</w:delText>
@@ -4844,13 +4960,13 @@
         <w:t>, number of repeated runs</w:t>
       </w:r>
       <w:commentRangeStart w:id="52"/>
-      <w:ins w:id="194" w:author="Workflow" w:date="2026-10-26T04:32:19Z">
+      <w:ins w:id="194" w:author="Workflow" w:date="2026-10-26T10:12:21Z">
         <w:r>
           <w:rPr/>
           <w:t>; SEM, standard error of the mean; SD, standard deviation.</w:t>
         </w:r>
       </w:ins>
-      <w:ins w:id="195" w:author="Workflow" w:date="2026-10-26T04:32:19Z">
+      <w:ins w:id="195" w:author="Workflow" w:date="2026-10-26T10:12:21Z">
         <w:r>
           <w:rPr/>
           <w:t xml:space="preserve"> For the three genomes Generation I ran on, the ten full Generation II runs pool five made with the machine idle and five on a second day in light desktop use; most Generation I runs on the 2023 call set and Livia Zaharia's genome were also made in light use (Supplementary S2)</w:t>
@@ -4865,7 +4981,7 @@
         <w:rPr/>
         <w:t xml:space="preserve"> The last column divides the median Generation I time by the median of the row; a </w:t>
       </w:r>
-      <w:ins w:id="196" w:author="Workflow" w:date="2026-10-26T04:32:19Z">
+      <w:ins w:id="196" w:author="Workflow" w:date="2026-10-26T10:12:21Z">
         <w:r>
           <w:rPr/>
           <w:t xml:space="preserve">dash marks a row with no comparison: a </w:t>
@@ -4875,7 +4991,7 @@
         <w:rPr/>
         <w:t>warm run</w:t>
       </w:r>
-      <w:ins w:id="197" w:author="Workflow" w:date="2026-10-26T04:32:19Z">
+      <w:ins w:id="197" w:author="Workflow" w:date="2026-10-26T10:12:21Z">
         <w:r>
           <w:rPr/>
           <w:t>, which</w:t>
@@ -4885,13 +5001,13 @@
         <w:rPr/>
         <w:t xml:space="preserve"> does not read the VCF, </w:t>
       </w:r>
-      <w:del w:id="198" w:author="Workflow" w:date="2026-10-26T04:32:19Z">
+      <w:del w:id="198" w:author="Workflow" w:date="2026-10-26T10:12:21Z">
         <w:r>
           <w:rPr/>
           <w:delText>so</w:delText>
         </w:r>
       </w:del>
-      <w:ins w:id="199" w:author="Workflow" w:date="2026-10-26T04:32:19Z">
+      <w:ins w:id="199" w:author="Workflow" w:date="2026-10-26T10:12:21Z">
         <w:r>
           <w:rPr/>
           <w:t>or</w:t>
@@ -4901,13 +5017,13 @@
         <w:rPr/>
         <w:t xml:space="preserve"> </w:t>
       </w:r>
-      <w:del w:id="200" w:author="Workflow" w:date="2026-10-26T04:32:19Z">
+      <w:del w:id="200" w:author="Workflow" w:date="2026-10-26T10:12:21Z">
         <w:r>
           <w:rPr/>
           <w:delText>it</w:delText>
         </w:r>
       </w:del>
-      <w:ins w:id="201" w:author="Workflow" w:date="2026-10-26T04:32:19Z">
+      <w:ins w:id="201" w:author="Workflow" w:date="2026-10-26T10:12:21Z">
         <w:r>
           <w:rPr/>
           <w:t>the</w:t>
@@ -4917,13 +5033,13 @@
         <w:rPr/>
         <w:t xml:space="preserve"> </w:t>
       </w:r>
-      <w:del w:id="202" w:author="Workflow" w:date="2026-10-26T04:32:19Z">
+      <w:del w:id="202" w:author="Workflow" w:date="2026-10-26T10:12:21Z">
         <w:r>
           <w:rPr/>
           <w:delText>is</w:delText>
         </w:r>
       </w:del>
-      <w:ins w:id="203" w:author="Workflow" w:date="2026-10-26T04:32:19Z">
+      <w:ins w:id="203" w:author="Workflow" w:date="2026-10-26T10:12:21Z">
         <w:r>
           <w:rPr/>
           <w:t>HG002 genome, on which Generation I was</w:t>
@@ -4933,13 +5049,13 @@
         <w:rPr/>
         <w:t xml:space="preserve"> not </w:t>
       </w:r>
-      <w:del w:id="204" w:author="Workflow" w:date="2026-10-26T04:32:19Z">
+      <w:del w:id="204" w:author="Workflow" w:date="2026-10-26T10:12:21Z">
         <w:r>
           <w:rPr/>
           <w:delText>compared</w:delText>
         </w:r>
       </w:del>
-      <w:ins w:id="205" w:author="Workflow" w:date="2026-10-26T04:32:19Z">
+      <w:ins w:id="205" w:author="Workflow" w:date="2026-10-26T10:12:21Z">
         <w:r>
           <w:rPr/>
           <w:t>run</w:t>
@@ -6474,19 +6590,19 @@
         <w:commentReference w:id="171"/>
       </w:r>
       <w:commentRangeStart w:id="53"/>
-      <w:del w:id="206" w:author="Story" w:date="2026-10-26T04:32:19Z">
+      <w:del w:id="206" w:author="Story" w:date="2026-10-26T10:12:21Z">
         <w:r>
           <w:rPr/>
           <w:delText>;</w:delText>
         </w:r>
       </w:del>
-      <w:ins w:id="207" w:author="Story" w:date="2026-10-26T04:32:19Z">
+      <w:ins w:id="207" w:author="Story" w:date="2026-10-26T10:12:21Z">
         <w:r>
           <w:rPr/>
           <w:t>.</w:t>
         </w:r>
       </w:ins>
-      <w:ins w:id="208" w:author="Story" w:date="2026-10-26T04:32:19Z">
+      <w:ins w:id="208" w:author="Story" w:date="2026-10-26T10:12:21Z">
         <w:r>
           <w:rPr/>
           <w:t xml:space="preserve"> The earlier benchmark, which matched genotypes by position alone, is kept in</w:t>
@@ -6496,13 +6612,13 @@
         <w:rPr/>
         <w:t xml:space="preserve"> Tables 3 and 4 </w:t>
       </w:r>
-      <w:del w:id="209" w:author="Story" w:date="2026-10-26T04:32:19Z">
+      <w:del w:id="209" w:author="Story" w:date="2026-10-26T10:12:21Z">
         <w:r>
           <w:rPr/>
           <w:delText>retain</w:delText>
         </w:r>
       </w:del>
-      <w:ins w:id="210" w:author="Story" w:date="2026-10-26T04:32:19Z">
+      <w:ins w:id="210" w:author="Story" w:date="2026-10-26T10:12:21Z">
         <w:r>
           <w:rPr/>
           <w:t>and</w:t>
@@ -6512,13 +6628,13 @@
         <w:rPr/>
         <w:t xml:space="preserve"> the </w:t>
       </w:r>
-      <w:del w:id="211" w:author="Story" w:date="2026-10-26T04:32:19Z">
+      <w:del w:id="211" w:author="Story" w:date="2026-10-26T10:12:21Z">
         <w:r>
           <w:rPr/>
           <w:delText>earlier</w:delText>
         </w:r>
       </w:del>
-      <w:ins w:id="212" w:author="Story" w:date="2026-10-26T04:32:19Z">
+      <w:ins w:id="212" w:author="Story" w:date="2026-10-26T10:12:21Z">
         <w:r>
           <w:rPr/>
           <w:t>paragraphs</w:t>
@@ -6528,13 +6644,13 @@
         <w:rPr/>
         <w:t xml:space="preserve"> </w:t>
       </w:r>
-      <w:del w:id="213" w:author="Story" w:date="2026-10-26T04:32:19Z">
+      <w:del w:id="213" w:author="Story" w:date="2026-10-26T10:12:21Z">
         <w:r>
           <w:rPr/>
           <w:delText>benchmark</w:delText>
         </w:r>
       </w:del>
-      <w:ins w:id="214" w:author="Story" w:date="2026-10-26T04:32:19Z">
+      <w:ins w:id="214" w:author="Story" w:date="2026-10-26T10:12:21Z">
         <w:r>
           <w:rPr/>
           <w:t>that discuss them,</w:t>
@@ -6562,7 +6678,7 @@
         <w:t xml:space="preserve"> Engines, timing and memory measurement are those of the benchmark script of just-prs 0.10.1, run through a harness described in Supplementary S3</w:t>
       </w:r>
       <w:commentRangeStart w:id="54"/>
-      <w:ins w:id="215" w:author="Workflow" w:date="2026-10-26T04:32:19Z">
+      <w:ins w:id="215" w:author="Workflow" w:date="2026-10-26T10:12:21Z">
         <w:r>
           <w:rPr/>
           <w:t xml:space="preserve"> on the workstation of Table S6</w:t>
@@ -6576,13 +6692,13 @@
         <w:commentReference w:id="54"/>
       </w:r>
       <w:commentRangeStart w:id="55"/>
-      <w:del w:id="216" w:author="Story" w:date="2026-10-26T04:32:19Z">
+      <w:del w:id="216" w:author="Story" w:date="2026-10-26T10:12:21Z">
         <w:r>
           <w:rPr/>
           <w:delText>;</w:delText>
         </w:r>
       </w:del>
-      <w:ins w:id="217" w:author="Story" w:date="2026-10-26T04:32:19Z">
+      <w:ins w:id="217" w:author="Story" w:date="2026-10-26T10:12:21Z">
         <w:r>
           <w:rPr/>
           <w:t>.</w:t>
@@ -6592,13 +6708,13 @@
         <w:rPr/>
         <w:t xml:space="preserve"> </w:t>
       </w:r>
-      <w:del w:id="218" w:author="Story" w:date="2026-10-26T04:32:19Z">
+      <w:del w:id="218" w:author="Story" w:date="2026-10-26T10:12:21Z">
         <w:r>
           <w:rPr/>
           <w:delText>each</w:delText>
         </w:r>
       </w:del>
-      <w:ins w:id="219" w:author="Story" w:date="2026-10-26T04:32:19Z">
+      <w:ins w:id="219" w:author="Story" w:date="2026-10-26T10:12:21Z">
         <w:r>
           <w:rPr/>
           <w:t>Each</w:t>
@@ -6623,7 +6739,7 @@
     <w:p>
       <w:commentRangeStart w:id="56"/>
       <w:commentRangeStart w:id="143"/>
-      <w:del w:id="220" w:author="Prose edit" w:date="2026-10-26T04:32:19Z">
+      <w:del w:id="220" w:author="Prose edit" w:date="2026-10-26T10:12:21Z">
         <w:r>
           <w:rPr/>
           <w:delText>just-prs 0.10.2 replaced the position match with the allele check of Section 3.2.</w:delText>
@@ -6636,7 +6752,7 @@
         </w:rPr>
         <w:commentReference w:id="143"/>
       </w:r>
-      <w:del w:id="221" w:author="Prose edit" w:date="2026-10-26T04:32:19Z">
+      <w:del w:id="221" w:author="Prose edit" w:date="2026-10-26T10:12:21Z">
         <w:r>
           <w:rPr/>
           <w:delText xml:space="preserve"> </w:delText>
@@ -6646,13 +6762,13 @@
         <w:rPr/>
         <w:t xml:space="preserve">The just-prs project reran the same 100 scores on the same genome with </w:t>
       </w:r>
-      <w:del w:id="222" w:author="Prose edit" w:date="2026-10-26T04:32:19Z">
+      <w:del w:id="222" w:author="Prose edit" w:date="2026-10-26T10:12:21Z">
         <w:r>
           <w:rPr/>
           <w:delText>it</w:delText>
         </w:r>
       </w:del>
-      <w:ins w:id="223" w:author="Prose edit" w:date="2026-10-26T04:32:19Z">
+      <w:ins w:id="223" w:author="Prose edit" w:date="2026-10-26T10:12:21Z">
         <w:r>
           <w:rPr/>
           <w:t>just-prs 0.10.2</w:t>
@@ -6755,7 +6871,7 @@
         <w:t xml:space="preserve"> Runtime of PRS computation engines (seconds per PGS ID)</w:t>
       </w:r>
       <w:commentRangeStart w:id="57"/>
-      <w:ins w:id="224" w:author="Workflow" w:date="2026-10-26T04:32:19Z">
+      <w:ins w:id="224" w:author="Workflow" w:date="2026-10-26T10:12:21Z">
         <w:r>
           <w:rPr/>
           <w:t xml:space="preserve"> in the just-prs 0.10.1 benchmark</w:t>
@@ -6765,7 +6881,7 @@
         <w:rPr/>
         <w:t>, fixed PLINK2 input</w:t>
       </w:r>
-      <w:ins w:id="225" w:author="Workflow" w:date="2026-10-26T04:32:19Z">
+      <w:ins w:id="225" w:author="Workflow" w:date="2026-10-26T10:12:21Z">
         <w:r>
           <w:rPr/>
           <w:t>; the text reports the 0.10.2 rerun</w:t>
@@ -6806,7 +6922,7 @@
         <w:commentReference w:id="157"/>
       </w:r>
       <w:commentRangeStart w:id="58"/>
-      <w:ins w:id="226" w:author="Workflow" w:date="2026-10-26T04:32:19Z">
+      <w:ins w:id="226" w:author="Workflow" w:date="2026-10-26T10:12:21Z">
         <w:r>
           <w:rPr/>
           <w:t xml:space="preserve"> PLINK2 runs as a separate process whose end the harness notices only at its next memory sample, taken every 0.1 s, so its times can exceed the true run time by up to 0.1 s (90 of its 100 times are 0.602 s, here and in the 0.10.2 rerun); its median therefore lies between about 0.50 and 0.60 s, and the speedups between about 6.2× and 7.4× for DuckDB and between 1.6× and 2.0× for Polars.</w:t>
@@ -7274,7 +7390,7 @@
         <w:t xml:space="preserve"> Score concordance between engines</w:t>
       </w:r>
       <w:commentRangeStart w:id="59"/>
-      <w:ins w:id="227" w:author="Workflow" w:date="2026-10-26T04:32:19Z">
+      <w:ins w:id="227" w:author="Workflow" w:date="2026-10-26T10:12:21Z">
         <w:r>
           <w:rPr/>
           <w:t xml:space="preserve"> in the just-prs 0.10.1 benchmark</w:t>
@@ -7284,13 +7400,13 @@
         <w:rPr/>
         <w:t>, with both PLINK2 inputs</w:t>
       </w:r>
-      <w:ins w:id="228" w:author="Workflow" w:date="2026-10-26T04:32:19Z">
+      <w:ins w:id="228" w:author="Workflow" w:date="2026-10-26T10:12:21Z">
         <w:r>
           <w:rPr/>
           <w:t>; the text reports the 0.10.2 rerun.</w:t>
         </w:r>
       </w:ins>
-      <w:ins w:id="229" w:author="Workflow" w:date="2026-10-26T04:32:19Z">
+      <w:ins w:id="229" w:author="Workflow" w:date="2026-10-26T10:12:21Z">
         <w:r>
           <w:rPr/>
           <w:t xml:space="preserve"> With the original input, PLINK2 scored 96 of the 100 scores</w:t>
@@ -7770,7 +7886,7 @@
         <w:t xml:space="preserve"> These values describe the benchmark configuration: </w:t>
       </w:r>
       <w:commentRangeStart w:id="60"/>
-      <w:ins w:id="230" w:author="Prose edit" w:date="2026-10-26T04:32:19Z">
+      <w:ins w:id="230" w:author="Prose edit" w:date="2026-10-26T10:12:21Z">
         <w:r>
           <w:rPr/>
           <w:t>homozygous-</w:t>
@@ -7780,7 +7896,7 @@
         <w:rPr/>
         <w:t>reference</w:t>
       </w:r>
-      <w:del w:id="231" w:author="Prose edit" w:date="2026-10-26T04:32:19Z">
+      <w:del w:id="231" w:author="Prose edit" w:date="2026-10-26T10:12:21Z">
         <w:r>
           <w:rPr/>
           <w:delText>-homozygote</w:delText>
@@ -7884,7 +8000,7 @@
         <w:t xml:space="preserve"> Heritability is a population-level statistic, not </w:t>
       </w:r>
       <w:commentRangeStart w:id="61"/>
-      <w:ins w:id="232" w:author="Prose edit" w:date="2026-10-26T04:32:19Z">
+      <w:ins w:id="232" w:author="Prose edit" w:date="2026-10-26T10:12:21Z">
         <w:r>
           <w:rPr/>
           <w:t xml:space="preserve">a measure of </w:t>
@@ -7911,7 +8027,7 @@
         <w:t xml:space="preserve"> However, </w:t>
       </w:r>
       <w:commentRangeStart w:id="62"/>
-      <w:del w:id="233" w:author="Deslop" w:date="2026-10-26T04:32:19Z">
+      <w:del w:id="233" w:author="Deslop" w:date="2026-10-26T10:12:21Z">
         <w:r>
           <w:rPr/>
           <w:delText xml:space="preserve">biology is </w:delText>
@@ -7921,7 +8037,7 @@
         <w:rPr/>
         <w:t xml:space="preserve">not </w:t>
       </w:r>
-      <w:ins w:id="234" w:author="Deslop" w:date="2026-10-26T04:32:19Z">
+      <w:ins w:id="234" w:author="Deslop" w:date="2026-10-26T10:12:21Z">
         <w:r>
           <w:rPr/>
           <w:t xml:space="preserve">all biological effects are </w:t>
@@ -7931,7 +8047,7 @@
         <w:rPr/>
         <w:t>linear</w:t>
       </w:r>
-      <w:del w:id="235" w:author="Deslop" w:date="2026-10-26T04:32:19Z">
+      <w:del w:id="235" w:author="Deslop" w:date="2026-10-26T10:12:21Z">
         <w:r>
           <w:rPr/>
           <w:delText>:</w:delText>
@@ -7944,7 +8060,7 @@
         </w:rPr>
         <w:commentReference w:id="80"/>
       </w:r>
-      <w:ins w:id="236" w:author="Deslop" w:date="2026-10-26T04:32:19Z">
+      <w:ins w:id="236" w:author="Deslop" w:date="2026-10-26T10:12:21Z">
         <w:r>
           <w:rPr/>
           <w:t>, and</w:t>
@@ -8025,31 +8141,31 @@
         <w:commentReference w:id="133"/>
       </w:r>
       <w:commentRangeStart w:id="63"/>
-      <w:del w:id="237" w:author="Workflow" w:date="2026-10-26T04:32:19Z">
+      <w:del w:id="237" w:author="Workflow" w:date="2026-10-26T10:12:21Z">
         <w:r>
           <w:rPr/>
           <w:delText>:</w:delText>
         </w:r>
       </w:del>
-      <w:ins w:id="238" w:author="Workflow" w:date="2026-10-26T04:32:19Z">
+      <w:ins w:id="238" w:author="Workflow" w:date="2026-10-26T10:12:21Z">
         <w:r>
           <w:rPr/>
           <w:t>.</w:t>
         </w:r>
       </w:ins>
-      <w:ins w:id="239" w:author="Workflow" w:date="2026-10-26T04:32:19Z">
+      <w:ins w:id="239" w:author="Workflow" w:date="2026-10-26T10:12:21Z">
         <w:r>
           <w:rPr/>
           <w:t xml:space="preserve"> In an annotation report, each variant row with an rsID has links that open a prepared question about it in ChatGPT, Claude, Perplexity or Grok.</w:t>
         </w:r>
       </w:ins>
-      <w:ins w:id="240" w:author="Workflow" w:date="2026-10-26T04:32:19Z">
+      <w:ins w:id="240" w:author="Workflow" w:date="2026-10-26T10:12:21Z">
         <w:r>
           <w:rPr/>
           <w:t xml:space="preserve"> Following one sends that variant's genotype, gene and stored interpretation to that provider.</w:t>
         </w:r>
       </w:ins>
-      <w:ins w:id="241" w:author="Workflow" w:date="2026-10-26T04:32:19Z">
+      <w:ins w:id="241" w:author="Workflow" w:date="2026-10-26T10:12:21Z">
         <w:r>
           <w:rPr/>
           <w:t xml:space="preserve"> More generally,</w:t>
@@ -8105,13 +8221,13 @@
       </w:r>
       <w:commentRangeStart w:id="64"/>
       <w:commentRangeStart w:id="105"/>
-      <w:del w:id="242" w:author="Integrity check" w:date="2026-10-26T04:32:19Z">
+      <w:del w:id="242" w:author="Integrity check" w:date="2026-10-26T10:12:21Z">
         <w:r>
           <w:rPr/>
           <w:delText>The</w:delText>
         </w:r>
       </w:del>
-      <w:ins w:id="243" w:author="Integrity check" w:date="2026-10-26T04:32:19Z">
+      <w:ins w:id="243" w:author="Integrity check" w:date="2026-10-26T10:12:21Z">
         <w:r>
           <w:rPr/>
           <w:t>In the European Union, the</w:t>
@@ -8121,7 +8237,7 @@
         <w:rPr/>
         <w:t xml:space="preserve"> GDPR's right of access (Article 15)</w:t>
       </w:r>
-      <w:del w:id="244" w:author="Integrity check" w:date="2026-10-26T04:32:19Z">
+      <w:del w:id="244" w:author="Integrity check" w:date="2026-10-26T10:12:21Z">
         <w:r>
           <w:rPr/>
           <w:delText xml:space="preserve"> already</w:delText>
@@ -8190,7 +8306,7 @@
     <w:p>
       <w:commentRangeStart w:id="65"/>
       <w:commentRangeStart w:id="142"/>
-      <w:del w:id="245" w:author="Prose edit" w:date="2026-10-26T04:32:19Z">
+      <w:del w:id="245" w:author="Prose edit" w:date="2026-10-26T10:12:21Z">
         <w:r>
           <w:rPr>
             <w:b/>
@@ -8198,7 +8314,7 @@
           <w:delText>Population</w:delText>
         </w:r>
       </w:del>
-      <w:ins w:id="246" w:author="Prose edit" w:date="2026-10-26T04:32:19Z">
+      <w:ins w:id="246" w:author="Prose edit" w:date="2026-10-26T10:12:21Z">
         <w:r>
           <w:rPr>
             <w:b/>
@@ -8212,7 +8328,7 @@
         </w:rPr>
         <w:t xml:space="preserve"> </w:t>
       </w:r>
-      <w:del w:id="247" w:author="Prose edit" w:date="2026-10-26T04:32:19Z">
+      <w:del w:id="247" w:author="Prose edit" w:date="2026-10-26T10:12:21Z">
         <w:r>
           <w:rPr>
             <w:b/>
@@ -8220,7 +8336,7 @@
           <w:delText>stratification</w:delText>
         </w:r>
       </w:del>
-      <w:ins w:id="248" w:author="Prose edit" w:date="2026-10-26T04:32:19Z">
+      <w:ins w:id="248" w:author="Prose edit" w:date="2026-10-26T10:12:21Z">
         <w:r>
           <w:rPr>
             <w:b/>
@@ -8254,7 +8370,7 @@
         <w:commentReference w:id="142"/>
       </w:r>
       <w:commentRangeStart w:id="66"/>
-      <w:del w:id="249" w:author="Deslop" w:date="2026-10-26T04:32:19Z">
+      <w:del w:id="249" w:author="Deslop" w:date="2026-10-26T10:12:21Z">
         <w:r>
           <w:rPr/>
           <w:delText>, not specific to this platform</w:delText>
@@ -8316,13 +8432,13 @@
         <w:commentReference w:id="146"/>
       </w:r>
       <w:commentRangeStart w:id="67"/>
-      <w:del w:id="250" w:author="Workflow" w:date="2026-10-26T04:32:19Z">
+      <w:del w:id="250" w:author="Workflow" w:date="2026-10-26T10:12:21Z">
         <w:r>
           <w:rPr/>
           <w:delText xml:space="preserve"> consumer microarray data</w:delText>
         </w:r>
       </w:del>
-      <w:ins w:id="251" w:author="Workflow" w:date="2026-10-26T04:32:19Z">
+      <w:ins w:id="251" w:author="Workflow" w:date="2026-10-26T10:12:21Z">
         <w:r>
           <w:rPr/>
           <w:t>,</w:t>
@@ -8332,7 +8448,7 @@
         <w:rPr/>
         <w:t xml:space="preserve"> experimentally</w:t>
       </w:r>
-      <w:ins w:id="252" w:author="Workflow" w:date="2026-10-26T04:32:19Z">
+      <w:ins w:id="252" w:author="Workflow" w:date="2026-10-26T10:12:21Z">
         <w:r>
           <w:rPr/>
           <w:t>, VCFs made from genotyping arrays</w:t>
@@ -8349,13 +8465,13 @@
         </w:rPr>
         <w:commentReference w:id="92"/>
       </w:r>
-      <w:ins w:id="253" w:author="Workflow" w:date="2026-10-26T04:32:19Z">
+      <w:ins w:id="253" w:author="Workflow" w:date="2026-10-26T10:12:21Z">
         <w:r>
           <w:rPr/>
           <w:t>.</w:t>
         </w:r>
       </w:ins>
-      <w:ins w:id="254" w:author="Workflow" w:date="2026-10-26T04:32:19Z">
+      <w:ins w:id="254" w:author="Workflow" w:date="2026-10-26T10:12:21Z">
         <w:r>
           <w:rPr/>
           <w:t xml:space="preserve"> Reading consumer raw files (23andMe, AncestryDNA) is so far a feature of the just-prs library and is planned for the web interface</w:t>
@@ -8385,19 +8501,19 @@
         <w:commentReference w:id="121"/>
       </w:r>
       <w:commentRangeStart w:id="68"/>
-      <w:del w:id="255" w:author="Workflow" w:date="2026-10-26T04:32:19Z">
+      <w:del w:id="255" w:author="Workflow" w:date="2026-10-26T10:12:21Z">
         <w:r>
           <w:rPr/>
           <w:delText>;</w:delText>
         </w:r>
       </w:del>
-      <w:ins w:id="256" w:author="Workflow" w:date="2026-10-26T04:32:19Z">
+      <w:ins w:id="256" w:author="Workflow" w:date="2026-10-26T10:12:21Z">
         <w:r>
           <w:rPr/>
           <w:t>.</w:t>
         </w:r>
       </w:ins>
-      <w:ins w:id="257" w:author="Workflow" w:date="2026-10-26T04:32:19Z">
+      <w:ins w:id="257" w:author="Workflow" w:date="2026-10-26T10:12:21Z">
         <w:r>
           <w:rPr/>
           <w:t xml:space="preserve"> The pipeline does not check a VCF's build, so a GRCh37 file would be joined at GRCh38 coordinates without a warning.</w:t>
@@ -8500,7 +8616,7 @@
       <w:commentRangeStart w:id="69"/>
       <w:commentRangeStart w:id="70"/>
       <w:commentRangeStart w:id="82"/>
-      <w:del w:id="258" w:author="Deslop" w:date="2026-10-26T04:32:19Z">
+      <w:del w:id="258" w:author="Deslop" w:date="2026-10-26T10:12:21Z">
         <w:r>
           <w:rPr/>
           <w:delText>We encourage the community to build and share modules.</w:delText>
@@ -8513,7 +8629,7 @@
         </w:rPr>
         <w:commentReference w:id="82"/>
       </w:r>
-      <w:del w:id="259" w:author="Deslop" w:date="2026-10-26T04:32:19Z">
+      <w:del w:id="259" w:author="Deslop" w:date="2026-10-26T10:12:21Z">
         <w:r>
           <w:rPr/>
           <w:delText xml:space="preserve"> </w:delText>
@@ -8538,13 +8654,13 @@
         <w:t>Modules published by others are not treated as accurate by default: community- and AI-generated modules will contain mistakes</w:t>
       </w:r>
       <w:commentRangeStart w:id="71"/>
-      <w:ins w:id="260" w:author="Deslop" w:date="2026-10-26T04:32:19Z">
+      <w:ins w:id="260" w:author="Deslop" w:date="2026-10-26T10:12:21Z">
         <w:r>
           <w:rPr/>
           <w:t>.</w:t>
         </w:r>
       </w:ins>
-      <w:ins w:id="261" w:author="Deslop" w:date="2026-10-26T04:32:19Z">
+      <w:ins w:id="261" w:author="Deslop" w:date="2026-10-26T10:12:21Z">
         <w:r>
           <w:rPr/>
           <w:t xml:space="preserve"> Instead of gatekeeping</w:t>
@@ -8554,7 +8670,7 @@
         <w:rPr/>
         <w:t>,</w:t>
       </w:r>
-      <w:del w:id="262" w:author="Deslop" w:date="2026-10-26T04:32:19Z">
+      <w:del w:id="262" w:author="Deslop" w:date="2026-10-26T10:12:21Z">
         <w:r>
           <w:rPr/>
           <w:delText xml:space="preserve"> and</w:delText>
@@ -8573,7 +8689,7 @@
       </w:r>
       <w:commentRangeStart w:id="72"/>
       <w:commentRangeStart w:id="79"/>
-      <w:del w:id="263" w:author="Deslop" w:date="2026-10-26T04:32:19Z">
+      <w:del w:id="263" w:author="Deslop" w:date="2026-10-26T10:12:21Z">
         <w:r>
           <w:rPr/>
           <w:delText xml:space="preserve">not by gatekeeping but </w:delText>
@@ -8604,7 +8720,7 @@
         <w:t>curator</w:t>
       </w:r>
       <w:commentRangeStart w:id="73"/>
-      <w:del w:id="264" w:author="Workflow" w:date="2026-10-26T04:32:19Z">
+      <w:del w:id="264" w:author="Workflow" w:date="2026-10-26T10:12:21Z">
         <w:r>
           <w:rPr/>
           <w:delText xml:space="preserve"> field</w:delText>
@@ -8614,13 +8730,13 @@
         <w:rPr/>
         <w:t xml:space="preserve">, </w:t>
       </w:r>
-      <w:del w:id="265" w:author="Workflow" w:date="2026-10-26T04:32:19Z">
+      <w:del w:id="265" w:author="Workflow" w:date="2026-10-26T10:12:21Z">
         <w:r>
           <w:rPr/>
           <w:delText>the</w:delText>
         </w:r>
       </w:del>
-      <w:ins w:id="266" w:author="Workflow" w:date="2026-10-26T04:32:19Z">
+      <w:ins w:id="266" w:author="Workflow" w:date="2026-10-26T10:12:21Z">
         <w:r>
           <w:rPr/>
           <w:t>method</w:t>
@@ -8630,13 +8746,13 @@
         <w:rPr/>
         <w:t xml:space="preserve"> </w:t>
       </w:r>
-      <w:del w:id="267" w:author="Workflow" w:date="2026-10-26T04:32:19Z">
+      <w:del w:id="267" w:author="Workflow" w:date="2026-10-26T10:12:21Z">
         <w:r>
           <w:rPr/>
           <w:delText>explicit</w:delText>
         </w:r>
       </w:del>
-      <w:ins w:id="268" w:author="Workflow" w:date="2026-10-26T04:32:19Z">
+      <w:ins w:id="268" w:author="Workflow" w:date="2026-10-26T10:12:21Z">
         <w:r>
           <w:rPr/>
           <w:t>and authorship fields, declared by each module's builder and not verified, which can record whether an</w:t>
@@ -8646,13 +8762,13 @@
         <w:rPr/>
         <w:t xml:space="preserve"> expert</w:t>
       </w:r>
-      <w:del w:id="269" w:author="Workflow" w:date="2026-10-26T04:32:19Z">
+      <w:del w:id="269" w:author="Workflow" w:date="2026-10-26T10:12:21Z">
         <w:r>
           <w:rPr/>
           <w:delText>-versus-</w:delText>
         </w:r>
       </w:del>
-      <w:ins w:id="270" w:author="Workflow" w:date="2026-10-26T04:32:19Z">
+      <w:ins w:id="270" w:author="Workflow" w:date="2026-10-26T10:12:21Z">
         <w:r>
           <w:rPr/>
           <w:t xml:space="preserve"> or an </w:t>
@@ -8662,13 +8778,13 @@
         <w:rPr/>
         <w:t xml:space="preserve">AI </w:t>
       </w:r>
-      <w:del w:id="271" w:author="Workflow" w:date="2026-10-26T04:32:19Z">
+      <w:del w:id="271" w:author="Workflow" w:date="2026-10-26T10:12:21Z">
         <w:r>
           <w:rPr/>
           <w:delText>distinction</w:delText>
         </w:r>
       </w:del>
-      <w:ins w:id="272" w:author="Workflow" w:date="2026-10-26T04:32:19Z">
+      <w:ins w:id="272" w:author="Workflow" w:date="2026-10-26T10:12:21Z">
         <w:r>
           <w:rPr/>
           <w:t>drafted a module</w:t>
@@ -8724,7 +8840,7 @@
         <w:t xml:space="preserve"> The reported benchmarks</w:t>
       </w:r>
       <w:commentRangeStart w:id="74"/>
-      <w:del w:id="273" w:author="Story" w:date="2026-10-26T04:32:19Z">
+      <w:del w:id="273" w:author="Story" w:date="2026-10-26T10:12:21Z">
         <w:r>
           <w:rPr/>
           <w:delText>, albeit on four call sets from three people for annotation and one for scoring,</w:delText>
@@ -8741,7 +8857,7 @@
         <w:rPr/>
         <w:t xml:space="preserve"> show faster annotation than the OakVar-based Generation I system run on the same machine and close numerical agreement between scoring engines</w:t>
       </w:r>
-      <w:ins w:id="274" w:author="Story" w:date="2026-10-26T04:32:19Z">
+      <w:ins w:id="274" w:author="Story" w:date="2026-10-26T10:12:21Z">
         <w:r>
           <w:rPr/>
           <w:t>, albeit on four call sets from three people for annotation and one for scoring</w:t>
@@ -9139,7 +9255,7 @@
         <w:t xml:space="preserve">), </w:t>
       </w:r>
       <w:commentRangeStart w:id="75"/>
-      <w:ins w:id="275" w:author="Workflow" w:date="2026-10-26T04:32:19Z">
+      <w:ins w:id="275" w:author="Workflow" w:date="2026-10-26T10:12:21Z">
         <w:r>
           <w:rPr/>
           <w:t xml:space="preserve">in the versions the benchmark used (Table S4), </w:t>
@@ -9149,19 +9265,19 @@
         <w:rPr/>
         <w:t>and the reference datasets the platform downloads are published on HuggingFace (https://huggingface.co/just-dna-seq</w:t>
       </w:r>
-      <w:ins w:id="276" w:author="Workflow" w:date="2026-10-26T04:32:19Z">
+      <w:ins w:id="276" w:author="Workflow" w:date="2026-10-26T10:12:21Z">
         <w:r>
           <w:rPr/>
           <w:t>).</w:t>
         </w:r>
       </w:ins>
-      <w:ins w:id="277" w:author="Workflow" w:date="2026-10-26T04:32:19Z">
+      <w:ins w:id="277" w:author="Workflow" w:date="2026-10-26T10:12:21Z">
         <w:r>
           <w:rPr/>
           <w:t xml:space="preserve"> The HuggingFace mirror of the modules (</w:t>
         </w:r>
       </w:ins>
-      <w:ins w:id="278" w:author="Workflow" w:date="2026-10-26T04:32:19Z">
+      <w:ins w:id="278" w:author="Workflow" w:date="2026-10-26T10:12:21Z">
         <w:r>
           <w:rPr>
             <w:rFonts w:ascii="Consolas" w:hAnsi="Consolas"/>
@@ -9169,7 +9285,7 @@
           <w:t>just-dna-seq/annotators</w:t>
         </w:r>
       </w:ins>
-      <w:ins w:id="279" w:author="Workflow" w:date="2026-10-26T04:32:19Z">
+      <w:ins w:id="279" w:author="Workflow" w:date="2026-10-26T10:12:21Z">
         <w:r>
           <w:rPr/>
           <w:t>), which the platform reads by default, differs from the registry for four of them (Table S4</w:t>
@@ -9418,13 +9534,13 @@
         <w:t xml:space="preserve"> </w:t>
       </w:r>
       <w:commentRangeStart w:id="76"/>
-      <w:ins w:id="280" w:author="Workflow" w:date="2026-10-26T04:32:19Z">
+      <w:ins w:id="280" w:author="Workflow" w:date="2026-10-26T10:12:21Z">
         <w:r>
           <w:rPr/>
           <w:t>Illumina's revolutionary NovaSeq X exceeds 200th order milestone in first quarter 2023.</w:t>
         </w:r>
       </w:ins>
-      <w:ins w:id="281" w:author="Workflow" w:date="2026-10-26T04:32:19Z">
+      <w:ins w:id="281" w:author="Workflow" w:date="2026-10-26T10:12:21Z">
         <w:r>
           <w:rPr/>
           <w:t xml:space="preserve"> </w:t>
@@ -9434,7 +9550,7 @@
         <w:rPr/>
         <w:t>Press release, 4 April 2023 ("$200 per genome"</w:t>
       </w:r>
-      <w:ins w:id="282" w:author="Workflow" w:date="2026-10-26T04:32:19Z">
+      <w:ins w:id="282" w:author="Workflow" w:date="2026-10-26T10:12:21Z">
         <w:r>
           <w:rPr/>
           <w:t>), https://www.illumina.com/company/news-center/press-releases/2023/4b48580b-42d4-419b-8512-5adcbb069836.html; NovaSeq X product page ("$200 USD genome"</w:t>
@@ -9444,7 +9560,7 @@
         <w:rPr/>
         <w:t>, sequencing consumables only, 100 Gb per genome)</w:t>
       </w:r>
-      <w:del w:id="283" w:author="Workflow" w:date="2026-10-26T04:32:19Z">
+      <w:del w:id="283" w:author="Workflow" w:date="2026-10-26T10:12:21Z">
         <w:r>
           <w:rPr/>
           <w:delText>; NovaSeq X product page</w:delText>
@@ -9598,7 +9714,7 @@
         <w:t xml:space="preserve"> PR Newswire, 24 February 2025.</w:t>
       </w:r>
       <w:commentRangeStart w:id="77"/>
-      <w:ins w:id="284" w:author="Workflow" w:date="2026-10-26T04:32:19Z">
+      <w:ins w:id="284" w:author="Workflow" w:date="2026-10-26T10:12:21Z">
         <w:r>
           <w:rPr/>
           <w:t xml:space="preserve"> https://www.prnewswire.com/news-releases/ultima-genomics-increases-output-by-over-50-and-lowers-sequencing-costs-by-a-further-20-with-the-introduction-of-ug-100-solaris-302382977.html</w:t>
@@ -10332,7 +10448,7 @@
 
 <file path=word/comments.xml><?xml version="1.0" encoding="utf-8"?>
 <w:comments xmlns:a="http://schemas.openxmlformats.org/drawingml/2006/main" xmlns:pic="http://schemas.openxmlformats.org/drawingml/2006/picture" xmlns:r="http://schemas.openxmlformats.org/officeDocument/2006/relationships" xmlns:w="http://schemas.openxmlformats.org/wordprocessingml/2006/main" xmlns:wp="http://schemas.openxmlformats.org/drawingml/2006/wordprocessingDrawing" xmlns:mc="http://schemas.openxmlformats.org/markup-compatibility/2006" xmlns:a14="http://schemas.microsoft.com/office/drawing/2010/main" xmlns:w14="http://schemas.microsoft.com/office/word/2010/wordml" xmlns:wpc="http://schemas.microsoft.com/office/word/2010/wordprocessingCanvas">
-  <w:comment w:id="0" w:author="Story" w:initials="S" w:date="2026-10-26T04:32:18Z">
+  <w:comment w:id="0" w:author="Story" w:initials="S" w:date="2026-10-26T10:12:20Z">
     <w:p>
       <w:pPr>
         <w:pStyle w:val="CommentText"/>
@@ -10348,7 +10464,7 @@
       </w:r>
     </w:p>
   </w:comment>
-  <w:comment w:id="1" w:author="Reference check" w:initials="RC" w:date="2026-10-26T04:32:18Z">
+  <w:comment w:id="1" w:author="Reference check" w:initials="RC" w:date="2026-10-26T10:12:20Z">
     <w:p>
       <w:pPr>
         <w:pStyle w:val="CommentText"/>
@@ -10364,7 +10480,7 @@
       </w:r>
     </w:p>
   </w:comment>
-  <w:comment w:id="2" w:author="Workflow" w:initials="W" w:date="2026-10-26T04:32:18Z">
+  <w:comment w:id="2" w:author="Workflow" w:initials="W" w:date="2026-10-26T10:12:20Z">
     <w:p>
       <w:pPr>
         <w:pStyle w:val="CommentText"/>
@@ -10380,7 +10496,7 @@
       </w:r>
     </w:p>
   </w:comment>
-  <w:comment w:id="3" w:author="Prose edit" w:initials="PE" w:date="2026-10-26T04:32:18Z">
+  <w:comment w:id="3" w:author="Prose edit" w:initials="PE" w:date="2026-10-26T10:12:20Z">
     <w:p>
       <w:pPr>
         <w:pStyle w:val="CommentText"/>
@@ -10396,7 +10512,7 @@
       </w:r>
     </w:p>
   </w:comment>
-  <w:comment w:id="4" w:author="Workflow" w:initials="W" w:date="2026-10-26T04:32:18Z">
+  <w:comment w:id="4" w:author="Workflow" w:initials="W" w:date="2026-10-26T10:12:20Z">
     <w:p>
       <w:pPr>
         <w:pStyle w:val="CommentText"/>
@@ -10412,7 +10528,7 @@
       </w:r>
     </w:p>
   </w:comment>
-  <w:comment w:id="5" w:author="Workflow" w:initials="W" w:date="2026-10-26T04:32:18Z">
+  <w:comment w:id="5" w:author="Workflow" w:initials="W" w:date="2026-10-26T10:12:20Z">
     <w:p>
       <w:pPr>
         <w:pStyle w:val="CommentText"/>
@@ -10428,7 +10544,7 @@
       </w:r>
     </w:p>
   </w:comment>
-  <w:comment w:id="6" w:author="Workflow" w:initials="W" w:date="2026-10-26T04:32:18Z">
+  <w:comment w:id="6" w:author="Workflow" w:initials="W" w:date="2026-10-26T10:12:20Z">
     <w:p>
       <w:pPr>
         <w:pStyle w:val="CommentText"/>
@@ -10444,7 +10560,7 @@
       </w:r>
     </w:p>
   </w:comment>
-  <w:comment w:id="7" w:author="Story" w:initials="S" w:date="2026-10-26T04:32:18Z">
+  <w:comment w:id="7" w:author="Story" w:initials="S" w:date="2026-10-26T10:12:20Z">
     <w:p>
       <w:pPr>
         <w:pStyle w:val="CommentText"/>
@@ -10460,7 +10576,7 @@
       </w:r>
     </w:p>
   </w:comment>
-  <w:comment w:id="8" w:author="Prose edit" w:initials="PE" w:date="2026-10-26T04:32:18Z">
+  <w:comment w:id="8" w:author="Prose edit" w:initials="PE" w:date="2026-10-26T10:12:20Z">
     <w:p>
       <w:pPr>
         <w:pStyle w:val="CommentText"/>
@@ -10476,7 +10592,7 @@
       </w:r>
     </w:p>
   </w:comment>
-  <w:comment w:id="9" w:author="Prose edit" w:initials="PE" w:date="2026-10-26T04:32:18Z">
+  <w:comment w:id="9" w:author="Prose edit" w:initials="PE" w:date="2026-10-26T10:12:20Z">
     <w:p>
       <w:pPr>
         <w:pStyle w:val="CommentText"/>
@@ -10492,7 +10608,7 @@
       </w:r>
     </w:p>
   </w:comment>
-  <w:comment w:id="10" w:author="Workflow" w:initials="W" w:date="2026-10-26T04:32:18Z">
+  <w:comment w:id="10" w:author="Workflow" w:initials="W" w:date="2026-10-26T10:12:20Z">
     <w:p>
       <w:pPr>
         <w:pStyle w:val="CommentText"/>
@@ -10508,7 +10624,7 @@
       </w:r>
     </w:p>
   </w:comment>
-  <w:comment w:id="11" w:author="Workflow" w:initials="W" w:date="2026-10-26T04:32:18Z">
+  <w:comment w:id="11" w:author="Workflow" w:initials="W" w:date="2026-10-26T10:12:20Z">
     <w:p>
       <w:pPr>
         <w:pStyle w:val="CommentText"/>
@@ -10524,7 +10640,7 @@
       </w:r>
     </w:p>
   </w:comment>
-  <w:comment w:id="12" w:author="Prose edit" w:initials="PE" w:date="2026-10-26T04:32:18Z">
+  <w:comment w:id="12" w:author="Prose edit" w:initials="PE" w:date="2026-10-26T10:12:20Z">
     <w:p>
       <w:pPr>
         <w:pStyle w:val="CommentText"/>
@@ -10540,7 +10656,7 @@
       </w:r>
     </w:p>
   </w:comment>
-  <w:comment w:id="13" w:author="Workflow" w:initials="W" w:date="2026-10-26T04:32:18Z">
+  <w:comment w:id="13" w:author="Workflow" w:initials="W" w:date="2026-10-26T10:12:20Z">
     <w:p>
       <w:pPr>
         <w:pStyle w:val="CommentText"/>
@@ -10556,7 +10672,7 @@
       </w:r>
     </w:p>
   </w:comment>
-  <w:comment w:id="14" w:author="Story" w:initials="S" w:date="2026-10-26T04:32:18Z">
+  <w:comment w:id="14" w:author="Story" w:initials="S" w:date="2026-10-26T10:12:20Z">
     <w:p>
       <w:pPr>
         <w:pStyle w:val="CommentText"/>
@@ -10572,7 +10688,7 @@
       </w:r>
     </w:p>
   </w:comment>
-  <w:comment w:id="15" w:author="Workflow" w:initials="W" w:date="2026-10-26T04:32:18Z">
+  <w:comment w:id="15" w:author="Workflow" w:initials="W" w:date="2026-10-26T10:12:20Z">
     <w:p>
       <w:pPr>
         <w:pStyle w:val="CommentText"/>
@@ -10588,7 +10704,7 @@
       </w:r>
     </w:p>
   </w:comment>
-  <w:comment w:id="16" w:author="Workflow" w:initials="W" w:date="2026-10-26T04:32:18Z">
+  <w:comment w:id="16" w:author="Workflow" w:initials="W" w:date="2026-10-26T10:12:20Z">
     <w:p>
       <w:pPr>
         <w:pStyle w:val="CommentText"/>
@@ -10604,7 +10720,7 @@
       </w:r>
     </w:p>
   </w:comment>
-  <w:comment w:id="17" w:author="Prose edit" w:initials="PE" w:date="2026-10-26T04:32:18Z">
+  <w:comment w:id="17" w:author="Prose edit" w:initials="PE" w:date="2026-10-26T10:12:20Z">
     <w:p>
       <w:pPr>
         <w:pStyle w:val="CommentText"/>
@@ -10620,7 +10736,7 @@
       </w:r>
     </w:p>
   </w:comment>
-  <w:comment w:id="18" w:author="Prose edit" w:initials="PE" w:date="2026-10-26T04:32:18Z">
+  <w:comment w:id="18" w:author="Prose edit" w:initials="PE" w:date="2026-10-26T10:12:20Z">
     <w:p>
       <w:pPr>
         <w:pStyle w:val="CommentText"/>
@@ -10636,7 +10752,7 @@
       </w:r>
     </w:p>
   </w:comment>
-  <w:comment w:id="19" w:author="Story" w:initials="S" w:date="2026-10-26T04:32:18Z">
+  <w:comment w:id="19" w:author="Story" w:initials="S" w:date="2026-10-26T10:12:20Z">
     <w:p>
       <w:pPr>
         <w:pStyle w:val="CommentText"/>
@@ -10652,7 +10768,7 @@
       </w:r>
     </w:p>
   </w:comment>
-  <w:comment w:id="20" w:author="Workflow" w:initials="W" w:date="2026-10-26T04:32:18Z">
+  <w:comment w:id="20" w:author="Workflow" w:initials="W" w:date="2026-10-26T10:12:20Z">
     <w:p>
       <w:pPr>
         <w:pStyle w:val="CommentText"/>
@@ -10668,7 +10784,7 @@
       </w:r>
     </w:p>
   </w:comment>
-  <w:comment w:id="21" w:author="Workflow" w:initials="W" w:date="2026-10-26T04:32:18Z">
+  <w:comment w:id="21" w:author="Workflow" w:initials="W" w:date="2026-10-26T10:12:20Z">
     <w:p>
       <w:pPr>
         <w:pStyle w:val="CommentText"/>
@@ -10684,7 +10800,7 @@
       </w:r>
     </w:p>
   </w:comment>
-  <w:comment w:id="22" w:author="Workflow" w:initials="W" w:date="2026-10-26T04:32:18Z">
+  <w:comment w:id="22" w:author="Workflow" w:initials="W" w:date="2026-10-26T10:12:20Z">
     <w:p>
       <w:pPr>
         <w:pStyle w:val="CommentText"/>
@@ -10700,7 +10816,7 @@
       </w:r>
     </w:p>
   </w:comment>
-  <w:comment w:id="23" w:author="Workflow" w:initials="W" w:date="2026-10-26T04:32:18Z">
+  <w:comment w:id="23" w:author="Workflow" w:initials="W" w:date="2026-10-26T10:12:20Z">
     <w:p>
       <w:pPr>
         <w:pStyle w:val="CommentText"/>
@@ -10716,7 +10832,7 @@
       </w:r>
     </w:p>
   </w:comment>
-  <w:comment w:id="24" w:author="Deslop" w:initials="D" w:date="2026-10-26T04:32:18Z">
+  <w:comment w:id="24" w:author="Deslop" w:initials="D" w:date="2026-10-26T10:12:20Z">
     <w:p>
       <w:pPr>
         <w:pStyle w:val="CommentText"/>
@@ -10732,7 +10848,7 @@
       </w:r>
     </w:p>
   </w:comment>
-  <w:comment w:id="25" w:author="Workflow" w:initials="W" w:date="2026-10-26T04:32:18Z">
+  <w:comment w:id="25" w:author="Workflow" w:initials="W" w:date="2026-10-26T10:12:20Z">
     <w:p>
       <w:pPr>
         <w:pStyle w:val="CommentText"/>
@@ -10748,7 +10864,7 @@
       </w:r>
     </w:p>
   </w:comment>
-  <w:comment w:id="26" w:author="Workflow" w:initials="W" w:date="2026-10-26T04:32:18Z">
+  <w:comment w:id="26" w:author="Workflow" w:initials="W" w:date="2026-10-26T10:12:20Z">
     <w:p>
       <w:pPr>
         <w:pStyle w:val="CommentText"/>
@@ -10764,7 +10880,7 @@
       </w:r>
     </w:p>
   </w:comment>
-  <w:comment w:id="27" w:author="Questions for the authors" w:initials="QF" w:date="2026-10-26T04:32:18Z">
+  <w:comment w:id="27" w:author="Questions for the authors" w:initials="QF" w:date="2026-10-26T10:12:20Z">
     <w:p>
       <w:pPr>
         <w:pStyle w:val="CommentText"/>
@@ -10780,7 +10896,7 @@
       </w:r>
     </w:p>
   </w:comment>
-  <w:comment w:id="28" w:author="Story" w:initials="S" w:date="2026-10-26T04:32:18Z">
+  <w:comment w:id="28" w:author="Story" w:initials="S" w:date="2026-10-26T10:12:20Z">
     <w:p>
       <w:pPr>
         <w:pStyle w:val="CommentText"/>
@@ -10796,7 +10912,7 @@
       </w:r>
     </w:p>
   </w:comment>
-  <w:comment w:id="29" w:author="Workflow" w:initials="W" w:date="2026-10-26T04:32:18Z">
+  <w:comment w:id="29" w:author="Workflow" w:initials="W" w:date="2026-10-26T10:12:20Z">
     <w:p>
       <w:pPr>
         <w:pStyle w:val="CommentText"/>
@@ -10812,7 +10928,7 @@
       </w:r>
     </w:p>
   </w:comment>
-  <w:comment w:id="30" w:author="Reference check" w:initials="RC" w:date="2026-10-26T04:32:18Z">
+  <w:comment w:id="30" w:author="Reference check" w:initials="RC" w:date="2026-10-26T10:12:20Z">
     <w:p>
       <w:pPr>
         <w:pStyle w:val="CommentText"/>
@@ -10828,7 +10944,7 @@
       </w:r>
     </w:p>
   </w:comment>
-  <w:comment w:id="31" w:author="Questions for the authors" w:initials="QF" w:date="2026-10-26T04:32:18Z">
+  <w:comment w:id="31" w:author="Questions for the authors" w:initials="QF" w:date="2026-10-26T10:12:20Z">
     <w:p>
       <w:pPr>
         <w:pStyle w:val="CommentText"/>
@@ -10844,7 +10960,7 @@
       </w:r>
     </w:p>
   </w:comment>
-  <w:comment w:id="32" w:author="Reference check" w:initials="RC" w:date="2026-10-26T04:32:18Z">
+  <w:comment w:id="32" w:author="Reference check" w:initials="RC" w:date="2026-10-26T10:12:20Z">
     <w:p>
       <w:pPr>
         <w:pStyle w:val="CommentText"/>
@@ -10860,7 +10976,7 @@
       </w:r>
     </w:p>
   </w:comment>
-  <w:comment w:id="33" w:author="Questions for the authors" w:initials="QF" w:date="2026-10-26T04:32:18Z">
+  <w:comment w:id="33" w:author="Questions for the authors" w:initials="QF" w:date="2026-10-26T10:12:20Z">
     <w:p>
       <w:pPr>
         <w:pStyle w:val="CommentText"/>
@@ -10876,7 +10992,7 @@
       </w:r>
     </w:p>
   </w:comment>
-  <w:comment w:id="34" w:author="Reference check" w:initials="RC" w:date="2026-10-26T04:32:18Z">
+  <w:comment w:id="34" w:author="Reference check" w:initials="RC" w:date="2026-10-26T10:12:20Z">
     <w:p>
       <w:pPr>
         <w:pStyle w:val="CommentText"/>
@@ -10892,7 +11008,7 @@
       </w:r>
     </w:p>
   </w:comment>
-  <w:comment w:id="35" w:author="Workflow" w:initials="W" w:date="2026-10-26T04:32:18Z">
+  <w:comment w:id="35" w:author="Workflow" w:initials="W" w:date="2026-10-26T10:12:20Z">
     <w:p>
       <w:pPr>
         <w:pStyle w:val="CommentText"/>
@@ -10908,7 +11024,7 @@
       </w:r>
     </w:p>
   </w:comment>
-  <w:comment w:id="36" w:author="Prose edit" w:initials="PE" w:date="2026-10-26T04:32:18Z">
+  <w:comment w:id="36" w:author="Prose edit" w:initials="PE" w:date="2026-10-26T10:12:20Z">
     <w:p>
       <w:pPr>
         <w:pStyle w:val="CommentText"/>
@@ -10924,7 +11040,7 @@
       </w:r>
     </w:p>
   </w:comment>
-  <w:comment w:id="37" w:author="Prose edit" w:initials="PE" w:date="2026-10-26T04:32:18Z">
+  <w:comment w:id="37" w:author="Prose edit" w:initials="PE" w:date="2026-10-26T10:12:20Z">
     <w:p>
       <w:pPr>
         <w:pStyle w:val="CommentText"/>
@@ -10940,7 +11056,7 @@
       </w:r>
     </w:p>
   </w:comment>
-  <w:comment w:id="38" w:author="Prose edit" w:initials="PE" w:date="2026-10-26T04:32:18Z">
+  <w:comment w:id="38" w:author="Prose edit" w:initials="PE" w:date="2026-10-26T10:12:20Z">
     <w:p>
       <w:pPr>
         <w:pStyle w:val="CommentText"/>
@@ -10956,7 +11072,7 @@
       </w:r>
     </w:p>
   </w:comment>
-  <w:comment w:id="39" w:author="Workflow" w:initials="W" w:date="2026-10-26T04:32:18Z">
+  <w:comment w:id="39" w:author="Workflow" w:initials="W" w:date="2026-10-26T10:12:20Z">
     <w:p>
       <w:pPr>
         <w:pStyle w:val="CommentText"/>
@@ -10972,7 +11088,7 @@
       </w:r>
     </w:p>
   </w:comment>
-  <w:comment w:id="40" w:author="Story" w:initials="S" w:date="2026-10-26T04:32:18Z">
+  <w:comment w:id="40" w:author="Story" w:initials="S" w:date="2026-10-26T10:12:20Z">
     <w:p>
       <w:pPr>
         <w:pStyle w:val="CommentText"/>
@@ -10988,7 +11104,7 @@
       </w:r>
     </w:p>
   </w:comment>
-  <w:comment w:id="41" w:author="Workflow" w:initials="W" w:date="2026-10-26T04:32:18Z">
+  <w:comment w:id="41" w:author="Workflow" w:initials="W" w:date="2026-10-26T10:12:20Z">
     <w:p>
       <w:pPr>
         <w:pStyle w:val="CommentText"/>
@@ -11004,7 +11120,7 @@
       </w:r>
     </w:p>
   </w:comment>
-  <w:comment w:id="42" w:author="Workflow" w:initials="W" w:date="2026-10-26T04:32:18Z">
+  <w:comment w:id="42" w:author="Workflow" w:initials="W" w:date="2026-10-26T10:12:20Z">
     <w:p>
       <w:pPr>
         <w:pStyle w:val="CommentText"/>
@@ -11020,7 +11136,7 @@
       </w:r>
     </w:p>
   </w:comment>
-  <w:comment w:id="43" w:author="Questions for the authors" w:initials="QF" w:date="2026-10-26T04:32:18Z">
+  <w:comment w:id="43" w:author="Questions for the authors" w:initials="QF" w:date="2026-10-26T10:12:20Z">
     <w:p>
       <w:pPr>
         <w:pStyle w:val="CommentText"/>
@@ -11036,7 +11152,7 @@
       </w:r>
     </w:p>
   </w:comment>
-  <w:comment w:id="44" w:author="Reporting check" w:initials="RC" w:date="2026-10-26T04:32:18Z">
+  <w:comment w:id="44" w:author="Reporting check" w:initials="RC" w:date="2026-10-26T10:12:20Z">
     <w:p>
       <w:pPr>
         <w:pStyle w:val="CommentText"/>
@@ -11052,7 +11168,7 @@
       </w:r>
     </w:p>
   </w:comment>
-  <w:comment w:id="45" w:author="Prose edit" w:initials="PE" w:date="2026-10-26T04:32:18Z">
+  <w:comment w:id="45" w:author="Prose edit" w:initials="PE" w:date="2026-10-26T10:12:20Z">
     <w:p>
       <w:pPr>
         <w:pStyle w:val="CommentText"/>
@@ -11068,7 +11184,7 @@
       </w:r>
     </w:p>
   </w:comment>
-  <w:comment w:id="46" w:author="Story" w:initials="S" w:date="2026-10-26T04:32:18Z">
+  <w:comment w:id="46" w:author="Story" w:initials="S" w:date="2026-10-26T10:12:20Z">
     <w:p>
       <w:pPr>
         <w:pStyle w:val="CommentText"/>
@@ -11084,7 +11200,7 @@
       </w:r>
     </w:p>
   </w:comment>
-  <w:comment w:id="47" w:author="Workflow" w:initials="W" w:date="2026-10-26T04:32:18Z">
+  <w:comment w:id="47" w:author="Workflow" w:initials="W" w:date="2026-10-26T10:12:20Z">
     <w:p>
       <w:pPr>
         <w:pStyle w:val="CommentText"/>
@@ -11100,7 +11216,7 @@
       </w:r>
     </w:p>
   </w:comment>
-  <w:comment w:id="48" w:author="Prose edit" w:initials="PE" w:date="2026-10-26T04:32:18Z">
+  <w:comment w:id="48" w:author="Prose edit" w:initials="PE" w:date="2026-10-26T10:12:20Z">
     <w:p>
       <w:pPr>
         <w:pStyle w:val="CommentText"/>
@@ -11116,7 +11232,7 @@
       </w:r>
     </w:p>
   </w:comment>
-  <w:comment w:id="49" w:author="Workflow" w:initials="W" w:date="2026-10-26T04:32:18Z">
+  <w:comment w:id="49" w:author="Workflow" w:initials="W" w:date="2026-10-26T10:12:20Z">
     <w:p>
       <w:pPr>
         <w:pStyle w:val="CommentText"/>
@@ -11132,7 +11248,7 @@
       </w:r>
     </w:p>
   </w:comment>
-  <w:comment w:id="50" w:author="Workflow" w:initials="W" w:date="2026-10-26T04:32:18Z">
+  <w:comment w:id="50" w:author="Workflow" w:initials="W" w:date="2026-10-26T10:12:20Z">
     <w:p>
       <w:pPr>
         <w:pStyle w:val="CommentText"/>
@@ -11148,7 +11264,7 @@
       </w:r>
     </w:p>
   </w:comment>
-  <w:comment w:id="51" w:author="Prose edit" w:initials="PE" w:date="2026-10-26T04:32:18Z">
+  <w:comment w:id="51" w:author="Prose edit" w:initials="PE" w:date="2026-10-26T10:12:20Z">
     <w:p>
       <w:pPr>
         <w:pStyle w:val="CommentText"/>
@@ -11164,7 +11280,7 @@
       </w:r>
     </w:p>
   </w:comment>
-  <w:comment w:id="52" w:author="Workflow" w:initials="W" w:date="2026-10-26T04:32:18Z">
+  <w:comment w:id="52" w:author="Workflow" w:initials="W" w:date="2026-10-26T10:12:20Z">
     <w:p>
       <w:pPr>
         <w:pStyle w:val="CommentText"/>
@@ -11180,7 +11296,7 @@
       </w:r>
     </w:p>
   </w:comment>
-  <w:comment w:id="53" w:author="Story" w:initials="S" w:date="2026-10-26T04:32:18Z">
+  <w:comment w:id="53" w:author="Story" w:initials="S" w:date="2026-10-26T10:12:20Z">
     <w:p>
       <w:pPr>
         <w:pStyle w:val="CommentText"/>
@@ -11196,7 +11312,7 @@
       </w:r>
     </w:p>
   </w:comment>
-  <w:comment w:id="54" w:author="Workflow" w:initials="W" w:date="2026-10-26T04:32:18Z">
+  <w:comment w:id="54" w:author="Workflow" w:initials="W" w:date="2026-10-26T10:12:20Z">
     <w:p>
       <w:pPr>
         <w:pStyle w:val="CommentText"/>
@@ -11212,7 +11328,7 @@
       </w:r>
     </w:p>
   </w:comment>
-  <w:comment w:id="55" w:author="Story" w:initials="S" w:date="2026-10-26T04:32:18Z">
+  <w:comment w:id="55" w:author="Story" w:initials="S" w:date="2026-10-26T10:12:20Z">
     <w:p>
       <w:pPr>
         <w:pStyle w:val="CommentText"/>
@@ -11228,7 +11344,7 @@
       </w:r>
     </w:p>
   </w:comment>
-  <w:comment w:id="56" w:author="Prose edit" w:initials="PE" w:date="2026-10-26T04:32:18Z">
+  <w:comment w:id="56" w:author="Prose edit" w:initials="PE" w:date="2026-10-26T10:12:20Z">
     <w:p>
       <w:pPr>
         <w:pStyle w:val="CommentText"/>
@@ -11244,7 +11360,7 @@
       </w:r>
     </w:p>
   </w:comment>
-  <w:comment w:id="57" w:author="Workflow" w:initials="W" w:date="2026-10-26T04:32:18Z">
+  <w:comment w:id="57" w:author="Workflow" w:initials="W" w:date="2026-10-26T10:12:20Z">
     <w:p>
       <w:pPr>
         <w:pStyle w:val="CommentText"/>
@@ -11260,7 +11376,7 @@
       </w:r>
     </w:p>
   </w:comment>
-  <w:comment w:id="58" w:author="Workflow" w:initials="W" w:date="2026-10-26T04:32:18Z">
+  <w:comment w:id="58" w:author="Workflow" w:initials="W" w:date="2026-10-26T10:12:20Z">
     <w:p>
       <w:pPr>
         <w:pStyle w:val="CommentText"/>
@@ -11276,7 +11392,7 @@
       </w:r>
     </w:p>
   </w:comment>
-  <w:comment w:id="59" w:author="Workflow" w:initials="W" w:date="2026-10-26T04:32:18Z">
+  <w:comment w:id="59" w:author="Workflow" w:initials="W" w:date="2026-10-26T10:12:20Z">
     <w:p>
       <w:pPr>
         <w:pStyle w:val="CommentText"/>
@@ -11292,7 +11408,7 @@
       </w:r>
     </w:p>
   </w:comment>
-  <w:comment w:id="60" w:author="Prose edit" w:initials="PE" w:date="2026-10-26T04:32:18Z">
+  <w:comment w:id="60" w:author="Prose edit" w:initials="PE" w:date="2026-10-26T10:12:20Z">
     <w:p>
       <w:pPr>
         <w:pStyle w:val="CommentText"/>
@@ -11308,7 +11424,7 @@
       </w:r>
     </w:p>
   </w:comment>
-  <w:comment w:id="61" w:author="Prose edit" w:initials="PE" w:date="2026-10-26T04:32:18Z">
+  <w:comment w:id="61" w:author="Prose edit" w:initials="PE" w:date="2026-10-26T10:12:20Z">
     <w:p>
       <w:pPr>
         <w:pStyle w:val="CommentText"/>
@@ -11324,7 +11440,7 @@
       </w:r>
     </w:p>
   </w:comment>
-  <w:comment w:id="62" w:author="Deslop" w:initials="D" w:date="2026-10-26T04:32:18Z">
+  <w:comment w:id="62" w:author="Deslop" w:initials="D" w:date="2026-10-26T10:12:20Z">
     <w:p>
       <w:pPr>
         <w:pStyle w:val="CommentText"/>
@@ -11340,7 +11456,7 @@
       </w:r>
     </w:p>
   </w:comment>
-  <w:comment w:id="63" w:author="Workflow" w:initials="W" w:date="2026-10-26T04:32:18Z">
+  <w:comment w:id="63" w:author="Workflow" w:initials="W" w:date="2026-10-26T10:12:20Z">
     <w:p>
       <w:pPr>
         <w:pStyle w:val="CommentText"/>
@@ -11356,7 +11472,7 @@
       </w:r>
     </w:p>
   </w:comment>
-  <w:comment w:id="64" w:author="Integrity check" w:initials="IC" w:date="2026-10-26T04:32:18Z">
+  <w:comment w:id="64" w:author="Integrity check" w:initials="IC" w:date="2026-10-26T10:12:20Z">
     <w:p>
       <w:pPr>
         <w:pStyle w:val="CommentText"/>
@@ -11372,7 +11488,7 @@
       </w:r>
     </w:p>
   </w:comment>
-  <w:comment w:id="65" w:author="Prose edit" w:initials="PE" w:date="2026-10-26T04:32:18Z">
+  <w:comment w:id="65" w:author="Prose edit" w:initials="PE" w:date="2026-10-26T10:12:20Z">
     <w:p>
       <w:pPr>
         <w:pStyle w:val="CommentText"/>
@@ -11388,7 +11504,7 @@
       </w:r>
     </w:p>
   </w:comment>
-  <w:comment w:id="66" w:author="Deslop" w:initials="D" w:date="2026-10-26T04:32:18Z">
+  <w:comment w:id="66" w:author="Deslop" w:initials="D" w:date="2026-10-26T10:12:20Z">
     <w:p>
       <w:pPr>
         <w:pStyle w:val="CommentText"/>
@@ -11404,7 +11520,7 @@
       </w:r>
     </w:p>
   </w:comment>
-  <w:comment w:id="67" w:author="Workflow" w:initials="W" w:date="2026-10-26T04:32:18Z">
+  <w:comment w:id="67" w:author="Workflow" w:initials="W" w:date="2026-10-26T10:12:20Z">
     <w:p>
       <w:pPr>
         <w:pStyle w:val="CommentText"/>
@@ -11420,7 +11536,7 @@
       </w:r>
     </w:p>
   </w:comment>
-  <w:comment w:id="68" w:author="Workflow" w:initials="W" w:date="2026-10-26T04:32:18Z">
+  <w:comment w:id="68" w:author="Workflow" w:initials="W" w:date="2026-10-26T10:12:20Z">
     <w:p>
       <w:pPr>
         <w:pStyle w:val="CommentText"/>
@@ -11436,7 +11552,7 @@
       </w:r>
     </w:p>
   </w:comment>
-  <w:comment w:id="69" w:author="Questions for the authors" w:initials="QF" w:date="2026-10-26T04:32:18Z">
+  <w:comment w:id="69" w:author="Questions for the authors" w:initials="QF" w:date="2026-10-26T10:12:20Z">
     <w:p>
       <w:pPr>
         <w:pStyle w:val="CommentText"/>
@@ -11452,7 +11568,7 @@
       </w:r>
     </w:p>
   </w:comment>
-  <w:comment w:id="70" w:author="Deslop" w:initials="D" w:date="2026-10-26T04:32:18Z">
+  <w:comment w:id="70" w:author="Deslop" w:initials="D" w:date="2026-10-26T10:12:20Z">
     <w:p>
       <w:pPr>
         <w:pStyle w:val="CommentText"/>
@@ -11468,7 +11584,7 @@
       </w:r>
     </w:p>
   </w:comment>
-  <w:comment w:id="71" w:author="Deslop" w:initials="D" w:date="2026-10-26T04:32:18Z">
+  <w:comment w:id="71" w:author="Deslop" w:initials="D" w:date="2026-10-26T10:12:20Z">
     <w:p>
       <w:pPr>
         <w:pStyle w:val="CommentText"/>
@@ -11484,7 +11600,7 @@
       </w:r>
     </w:p>
   </w:comment>
-  <w:comment w:id="72" w:author="Deslop" w:initials="D" w:date="2026-10-26T04:32:18Z">
+  <w:comment w:id="72" w:author="Deslop" w:initials="D" w:date="2026-10-26T10:12:20Z">
     <w:p>
       <w:pPr>
         <w:pStyle w:val="CommentText"/>
@@ -11500,7 +11616,7 @@
       </w:r>
     </w:p>
   </w:comment>
-  <w:comment w:id="73" w:author="Workflow" w:initials="W" w:date="2026-10-26T04:32:18Z">
+  <w:comment w:id="73" w:author="Workflow" w:initials="W" w:date="2026-10-26T10:12:20Z">
     <w:p>
       <w:pPr>
         <w:pStyle w:val="CommentText"/>
@@ -11516,7 +11632,7 @@
       </w:r>
     </w:p>
   </w:comment>
-  <w:comment w:id="74" w:author="Story" w:initials="S" w:date="2026-10-26T04:32:18Z">
+  <w:comment w:id="74" w:author="Story" w:initials="S" w:date="2026-10-26T10:12:20Z">
     <w:p>
       <w:pPr>
         <w:pStyle w:val="CommentText"/>
@@ -11532,7 +11648,7 @@
       </w:r>
     </w:p>
   </w:comment>
-  <w:comment w:id="75" w:author="Workflow" w:initials="W" w:date="2026-10-26T04:32:18Z">
+  <w:comment w:id="75" w:author="Workflow" w:initials="W" w:date="2026-10-26T10:12:20Z">
     <w:p>
       <w:pPr>
         <w:pStyle w:val="CommentText"/>
@@ -11548,7 +11664,7 @@
       </w:r>
     </w:p>
   </w:comment>
-  <w:comment w:id="76" w:author="Workflow" w:initials="W" w:date="2026-10-26T04:32:18Z">
+  <w:comment w:id="76" w:author="Workflow" w:initials="W" w:date="2026-10-26T10:12:20Z">
     <w:p>
       <w:pPr>
         <w:pStyle w:val="CommentText"/>
@@ -11564,7 +11680,7 @@
       </w:r>
     </w:p>
   </w:comment>
-  <w:comment w:id="77" w:author="Workflow" w:initials="W" w:date="2026-10-26T04:32:18Z">
+  <w:comment w:id="77" w:author="Workflow" w:initials="W" w:date="2026-10-26T10:12:20Z">
     <w:p>
       <w:pPr>
         <w:pStyle w:val="CommentText"/>
@@ -11580,7 +11696,7 @@
       </w:r>
     </w:p>
   </w:comment>
-  <w:comment w:id="78" w:author="Deslop" w:initials="D" w:date="2026-10-26T04:32:18Z">
+  <w:comment w:id="78" w:author="Deslop" w:initials="D" w:date="2026-10-26T10:12:20Z">
     <w:p>
       <w:pPr>
         <w:pStyle w:val="CommentText"/>
@@ -11596,7 +11712,7 @@
       </w:r>
     </w:p>
   </w:comment>
-  <w:comment w:id="79" w:author="Deslop" w:initials="D" w:date="2026-10-26T04:32:18Z">
+  <w:comment w:id="79" w:author="Deslop" w:initials="D" w:date="2026-10-26T10:12:20Z">
     <w:p>
       <w:pPr>
         <w:pStyle w:val="CommentText"/>
@@ -11612,7 +11728,7 @@
       </w:r>
     </w:p>
   </w:comment>
-  <w:comment w:id="80" w:author="Deslop" w:initials="D" w:date="2026-10-26T04:32:18Z">
+  <w:comment w:id="80" w:author="Deslop" w:initials="D" w:date="2026-10-26T10:12:20Z">
     <w:p>
       <w:pPr>
         <w:pStyle w:val="CommentText"/>
@@ -11628,7 +11744,7 @@
       </w:r>
     </w:p>
   </w:comment>
-  <w:comment w:id="81" w:author="Deslop" w:initials="D" w:date="2026-10-26T04:32:18Z">
+  <w:comment w:id="81" w:author="Deslop" w:initials="D" w:date="2026-10-26T10:12:20Z">
     <w:p>
       <w:pPr>
         <w:pStyle w:val="CommentText"/>
@@ -11644,7 +11760,7 @@
       </w:r>
     </w:p>
   </w:comment>
-  <w:comment w:id="82" w:author="Deslop" w:initials="D" w:date="2026-10-26T04:32:18Z">
+  <w:comment w:id="82" w:author="Deslop" w:initials="D" w:date="2026-10-26T10:12:20Z">
     <w:p>
       <w:pPr>
         <w:pStyle w:val="CommentText"/>
@@ -11660,7 +11776,7 @@
       </w:r>
     </w:p>
   </w:comment>
-  <w:comment w:id="83" w:author="Figures and tables" w:initials="FA" w:date="2026-10-26T04:32:18Z">
+  <w:comment w:id="83" w:author="Figures and tables" w:initials="FA" w:date="2026-10-26T10:12:20Z">
     <w:p>
       <w:pPr>
         <w:pStyle w:val="CommentText"/>
@@ -11676,7 +11792,7 @@
       </w:r>
     </w:p>
   </w:comment>
-  <w:comment w:id="84" w:author="Figures and tables" w:initials="FA" w:date="2026-10-26T04:32:18Z">
+  <w:comment w:id="84" w:author="Figures and tables" w:initials="FA" w:date="2026-10-26T10:12:20Z">
     <w:p>
       <w:pPr>
         <w:pStyle w:val="CommentText"/>
@@ -11692,7 +11808,7 @@
       </w:r>
     </w:p>
   </w:comment>
-  <w:comment w:id="85" w:author="Figures and tables" w:initials="FA" w:date="2026-10-26T04:32:18Z">
+  <w:comment w:id="85" w:author="Figures and tables" w:initials="FA" w:date="2026-10-26T10:12:20Z">
     <w:p>
       <w:pPr>
         <w:pStyle w:val="CommentText"/>
@@ -11708,7 +11824,7 @@
       </w:r>
     </w:p>
   </w:comment>
-  <w:comment w:id="86" w:author="Figures and tables" w:initials="FA" w:date="2026-10-26T04:32:18Z">
+  <w:comment w:id="86" w:author="Figures and tables" w:initials="FA" w:date="2026-10-26T10:12:20Z">
     <w:p>
       <w:pPr>
         <w:pStyle w:val="CommentText"/>
@@ -11724,7 +11840,7 @@
       </w:r>
     </w:p>
   </w:comment>
-  <w:comment w:id="87" w:author="Figures and tables" w:initials="FA" w:date="2026-10-26T04:32:18Z">
+  <w:comment w:id="87" w:author="Figures and tables" w:initials="FA" w:date="2026-10-26T10:12:20Z">
     <w:p>
       <w:pPr>
         <w:pStyle w:val="CommentText"/>
@@ -11740,7 +11856,7 @@
       </w:r>
     </w:p>
   </w:comment>
-  <w:comment w:id="88" w:author="Figures and tables" w:initials="FA" w:date="2026-10-26T04:32:18Z">
+  <w:comment w:id="88" w:author="Figures and tables" w:initials="FA" w:date="2026-10-26T10:12:20Z">
     <w:p>
       <w:pPr>
         <w:pStyle w:val="CommentText"/>
@@ -11756,7 +11872,7 @@
       </w:r>
     </w:p>
   </w:comment>
-  <w:comment w:id="89" w:author="Integrity check" w:initials="IC" w:date="2026-10-26T04:32:18Z">
+  <w:comment w:id="89" w:author="Integrity check" w:initials="IC" w:date="2026-10-26T10:12:20Z">
     <w:p>
       <w:pPr>
         <w:pStyle w:val="CommentText"/>
@@ -11772,7 +11888,7 @@
       </w:r>
     </w:p>
   </w:comment>
-  <w:comment w:id="90" w:author="Integrity check" w:initials="IC" w:date="2026-10-26T04:32:18Z">
+  <w:comment w:id="90" w:author="Integrity check" w:initials="IC" w:date="2026-10-26T10:12:20Z">
     <w:p>
       <w:pPr>
         <w:pStyle w:val="CommentText"/>
@@ -11788,7 +11904,7 @@
       </w:r>
     </w:p>
   </w:comment>
-  <w:comment w:id="91" w:author="Integrity check" w:initials="IC" w:date="2026-10-26T04:32:18Z">
+  <w:comment w:id="91" w:author="Integrity check" w:initials="IC" w:date="2026-10-26T10:12:20Z">
     <w:p>
       <w:pPr>
         <w:pStyle w:val="CommentText"/>
@@ -11804,7 +11920,7 @@
       </w:r>
     </w:p>
   </w:comment>
-  <w:comment w:id="92" w:author="Integrity check" w:initials="IC" w:date="2026-10-26T04:32:18Z">
+  <w:comment w:id="92" w:author="Integrity check" w:initials="IC" w:date="2026-10-26T10:12:20Z">
     <w:p>
       <w:pPr>
         <w:pStyle w:val="CommentText"/>
@@ -11820,7 +11936,7 @@
       </w:r>
     </w:p>
   </w:comment>
-  <w:comment w:id="93" w:author="Integrity check" w:initials="IC" w:date="2026-10-26T04:32:18Z">
+  <w:comment w:id="93" w:author="Integrity check" w:initials="IC" w:date="2026-10-26T10:12:20Z">
     <w:p>
       <w:pPr>
         <w:pStyle w:val="CommentText"/>
@@ -11836,7 +11952,7 @@
       </w:r>
     </w:p>
   </w:comment>
-  <w:comment w:id="94" w:author="Integrity check" w:initials="IC" w:date="2026-10-26T04:32:18Z">
+  <w:comment w:id="94" w:author="Integrity check" w:initials="IC" w:date="2026-10-26T10:12:20Z">
     <w:p>
       <w:pPr>
         <w:pStyle w:val="CommentText"/>
@@ -11852,7 +11968,7 @@
       </w:r>
     </w:p>
   </w:comment>
-  <w:comment w:id="95" w:author="Integrity check" w:initials="IC" w:date="2026-10-26T04:32:18Z">
+  <w:comment w:id="95" w:author="Integrity check" w:initials="IC" w:date="2026-10-26T10:12:20Z">
     <w:p>
       <w:pPr>
         <w:pStyle w:val="CommentText"/>
@@ -11868,7 +11984,7 @@
       </w:r>
     </w:p>
   </w:comment>
-  <w:comment w:id="96" w:author="Integrity check" w:initials="IC" w:date="2026-10-26T04:32:18Z">
+  <w:comment w:id="96" w:author="Integrity check" w:initials="IC" w:date="2026-10-26T10:12:20Z">
     <w:p>
       <w:pPr>
         <w:pStyle w:val="CommentText"/>
@@ -11884,7 +12000,7 @@
       </w:r>
     </w:p>
   </w:comment>
-  <w:comment w:id="97" w:author="Integrity check" w:initials="IC" w:date="2026-10-26T04:32:18Z">
+  <w:comment w:id="97" w:author="Integrity check" w:initials="IC" w:date="2026-10-26T10:12:20Z">
     <w:p>
       <w:pPr>
         <w:pStyle w:val="CommentText"/>
@@ -11900,7 +12016,7 @@
       </w:r>
     </w:p>
   </w:comment>
-  <w:comment w:id="98" w:author="Integrity check" w:initials="IC" w:date="2026-10-26T04:32:18Z">
+  <w:comment w:id="98" w:author="Integrity check" w:initials="IC" w:date="2026-10-26T10:12:20Z">
     <w:p>
       <w:pPr>
         <w:pStyle w:val="CommentText"/>
@@ -11916,7 +12032,7 @@
       </w:r>
     </w:p>
   </w:comment>
-  <w:comment w:id="99" w:author="Integrity check" w:initials="IC" w:date="2026-10-26T04:32:18Z">
+  <w:comment w:id="99" w:author="Integrity check" w:initials="IC" w:date="2026-10-26T10:12:20Z">
     <w:p>
       <w:pPr>
         <w:pStyle w:val="CommentText"/>
@@ -11932,7 +12048,7 @@
       </w:r>
     </w:p>
   </w:comment>
-  <w:comment w:id="100" w:author="Integrity check" w:initials="IC" w:date="2026-10-26T04:32:18Z">
+  <w:comment w:id="100" w:author="Integrity check" w:initials="IC" w:date="2026-10-26T10:12:20Z">
     <w:p>
       <w:pPr>
         <w:pStyle w:val="CommentText"/>
@@ -11948,7 +12064,7 @@
       </w:r>
     </w:p>
   </w:comment>
-  <w:comment w:id="101" w:author="Integrity check" w:initials="IC" w:date="2026-10-26T04:32:18Z">
+  <w:comment w:id="101" w:author="Integrity check" w:initials="IC" w:date="2026-10-26T10:12:20Z">
     <w:p>
       <w:pPr>
         <w:pStyle w:val="CommentText"/>
@@ -11964,7 +12080,7 @@
       </w:r>
     </w:p>
   </w:comment>
-  <w:comment w:id="102" w:author="Integrity check" w:initials="IC" w:date="2026-10-26T04:32:18Z">
+  <w:comment w:id="102" w:author="Integrity check" w:initials="IC" w:date="2026-10-26T10:12:20Z">
     <w:p>
       <w:pPr>
         <w:pStyle w:val="CommentText"/>
@@ -11980,7 +12096,7 @@
       </w:r>
     </w:p>
   </w:comment>
-  <w:comment w:id="103" w:author="Integrity check" w:initials="IC" w:date="2026-10-26T04:32:18Z">
+  <w:comment w:id="103" w:author="Integrity check" w:initials="IC" w:date="2026-10-26T10:12:20Z">
     <w:p>
       <w:pPr>
         <w:pStyle w:val="CommentText"/>
@@ -11996,7 +12112,7 @@
       </w:r>
     </w:p>
   </w:comment>
-  <w:comment w:id="104" w:author="Integrity check" w:initials="IC" w:date="2026-10-26T04:32:18Z">
+  <w:comment w:id="104" w:author="Integrity check" w:initials="IC" w:date="2026-10-26T10:12:20Z">
     <w:p>
       <w:pPr>
         <w:pStyle w:val="CommentText"/>
@@ -12012,7 +12128,7 @@
       </w:r>
     </w:p>
   </w:comment>
-  <w:comment w:id="105" w:author="Integrity check" w:initials="IC" w:date="2026-10-26T04:32:18Z">
+  <w:comment w:id="105" w:author="Integrity check" w:initials="IC" w:date="2026-10-26T10:12:20Z">
     <w:p>
       <w:pPr>
         <w:pStyle w:val="CommentText"/>
@@ -12028,7 +12144,7 @@
       </w:r>
     </w:p>
   </w:comment>
-  <w:comment w:id="106" w:author="Integrity check" w:initials="IC" w:date="2026-10-26T04:32:18Z">
+  <w:comment w:id="106" w:author="Integrity check" w:initials="IC" w:date="2026-10-26T10:12:20Z">
     <w:p>
       <w:pPr>
         <w:pStyle w:val="CommentText"/>
@@ -12044,7 +12160,7 @@
       </w:r>
     </w:p>
   </w:comment>
-  <w:comment w:id="107" w:author="Integrity check" w:initials="IC" w:date="2026-10-26T04:32:18Z">
+  <w:comment w:id="107" w:author="Integrity check" w:initials="IC" w:date="2026-10-26T10:12:20Z">
     <w:p>
       <w:pPr>
         <w:pStyle w:val="CommentText"/>
@@ -12060,7 +12176,7 @@
       </w:r>
     </w:p>
   </w:comment>
-  <w:comment w:id="108" w:author="Integrity check" w:initials="IC" w:date="2026-10-26T04:32:18Z">
+  <w:comment w:id="108" w:author="Integrity check" w:initials="IC" w:date="2026-10-26T10:12:20Z">
     <w:p>
       <w:pPr>
         <w:pStyle w:val="CommentText"/>
@@ -12076,7 +12192,7 @@
       </w:r>
     </w:p>
   </w:comment>
-  <w:comment w:id="109" w:author="Journal adaptation" w:initials="JA" w:date="2026-10-26T04:32:18Z">
+  <w:comment w:id="109" w:author="Journal adaptation" w:initials="JA" w:date="2026-10-26T10:12:20Z">
     <w:p>
       <w:pPr>
         <w:pStyle w:val="CommentText"/>
@@ -12092,7 +12208,7 @@
       </w:r>
     </w:p>
   </w:comment>
-  <w:comment w:id="110" w:author="Journal adaptation" w:initials="JA" w:date="2026-10-26T04:32:18Z">
+  <w:comment w:id="110" w:author="Journal adaptation" w:initials="JA" w:date="2026-10-26T10:12:20Z">
     <w:p>
       <w:pPr>
         <w:pStyle w:val="CommentText"/>
@@ -12108,7 +12224,7 @@
       </w:r>
     </w:p>
   </w:comment>
-  <w:comment w:id="111" w:author="Journal adaptation" w:initials="JA" w:date="2026-10-26T04:32:18Z">
+  <w:comment w:id="111" w:author="Journal adaptation" w:initials="JA" w:date="2026-10-26T10:12:20Z">
     <w:p>
       <w:pPr>
         <w:pStyle w:val="CommentText"/>
@@ -12124,7 +12240,7 @@
       </w:r>
     </w:p>
   </w:comment>
-  <w:comment w:id="112" w:author="Simulated reviewers" w:initials="SR" w:date="2026-10-26T04:32:18Z">
+  <w:comment w:id="112" w:author="Simulated reviewers" w:initials="SR" w:date="2026-10-26T10:12:20Z">
     <w:p>
       <w:pPr>
         <w:pStyle w:val="CommentText"/>
@@ -12140,7 +12256,7 @@
       </w:r>
     </w:p>
   </w:comment>
-  <w:comment w:id="113" w:author="Simulated reviewers" w:initials="SR" w:date="2026-10-26T04:32:18Z">
+  <w:comment w:id="113" w:author="Simulated reviewers" w:initials="SR" w:date="2026-10-26T10:12:20Z">
     <w:p>
       <w:pPr>
         <w:pStyle w:val="CommentText"/>
@@ -12156,7 +12272,7 @@
       </w:r>
     </w:p>
   </w:comment>
-  <w:comment w:id="114" w:author="Simulated reviewers" w:initials="SR" w:date="2026-10-26T04:32:18Z">
+  <w:comment w:id="114" w:author="Simulated reviewers" w:initials="SR" w:date="2026-10-26T10:12:20Z">
     <w:p>
       <w:pPr>
         <w:pStyle w:val="CommentText"/>
@@ -12172,7 +12288,7 @@
       </w:r>
     </w:p>
   </w:comment>
-  <w:comment w:id="115" w:author="Simulated reviewers" w:initials="SR" w:date="2026-10-26T04:32:18Z">
+  <w:comment w:id="115" w:author="Simulated reviewers" w:initials="SR" w:date="2026-10-26T10:12:20Z">
     <w:p>
       <w:pPr>
         <w:pStyle w:val="CommentText"/>
@@ -12188,7 +12304,7 @@
       </w:r>
     </w:p>
   </w:comment>
-  <w:comment w:id="116" w:author="Simulated reviewers" w:initials="SR" w:date="2026-10-26T04:32:18Z">
+  <w:comment w:id="116" w:author="Simulated reviewers" w:initials="SR" w:date="2026-10-26T10:12:20Z">
     <w:p>
       <w:pPr>
         <w:pStyle w:val="CommentText"/>
@@ -12204,7 +12320,7 @@
       </w:r>
     </w:p>
   </w:comment>
-  <w:comment w:id="117" w:author="Simulated reviewers" w:initials="SR" w:date="2026-10-26T04:32:19Z">
+  <w:comment w:id="117" w:author="Simulated reviewers" w:initials="SR" w:date="2026-10-26T10:12:20Z">
     <w:p>
       <w:pPr>
         <w:pStyle w:val="CommentText"/>
@@ -12220,7 +12336,7 @@
       </w:r>
     </w:p>
   </w:comment>
-  <w:comment w:id="118" w:author="Simulated reviewers" w:initials="SR" w:date="2026-10-26T04:32:19Z">
+  <w:comment w:id="118" w:author="Simulated reviewers" w:initials="SR" w:date="2026-10-26T10:12:20Z">
     <w:p>
       <w:pPr>
         <w:pStyle w:val="CommentText"/>
@@ -12236,7 +12352,7 @@
       </w:r>
     </w:p>
   </w:comment>
-  <w:comment w:id="119" w:author="Simulated reviewers" w:initials="SR" w:date="2026-10-26T04:32:19Z">
+  <w:comment w:id="119" w:author="Simulated reviewers" w:initials="SR" w:date="2026-10-26T10:12:20Z">
     <w:p>
       <w:pPr>
         <w:pStyle w:val="CommentText"/>
@@ -12252,7 +12368,7 @@
       </w:r>
     </w:p>
   </w:comment>
-  <w:comment w:id="120" w:author="Simulated reviewers" w:initials="SR" w:date="2026-10-26T04:32:19Z">
+  <w:comment w:id="120" w:author="Simulated reviewers" w:initials="SR" w:date="2026-10-26T10:12:20Z">
     <w:p>
       <w:pPr>
         <w:pStyle w:val="CommentText"/>
@@ -12268,7 +12384,7 @@
       </w:r>
     </w:p>
   </w:comment>
-  <w:comment w:id="121" w:author="Simulated reviewers" w:initials="SR" w:date="2026-10-26T04:32:19Z">
+  <w:comment w:id="121" w:author="Simulated reviewers" w:initials="SR" w:date="2026-10-26T10:12:20Z">
     <w:p>
       <w:pPr>
         <w:pStyle w:val="CommentText"/>
@@ -12284,7 +12400,7 @@
       </w:r>
     </w:p>
   </w:comment>
-  <w:comment w:id="122" w:author="Simulated reviewers" w:initials="SR" w:date="2026-10-26T04:32:19Z">
+  <w:comment w:id="122" w:author="Simulated reviewers" w:initials="SR" w:date="2026-10-26T10:12:20Z">
     <w:p>
       <w:pPr>
         <w:pStyle w:val="CommentText"/>
@@ -12300,7 +12416,7 @@
       </w:r>
     </w:p>
   </w:comment>
-  <w:comment w:id="123" w:author="Simulated reviewers" w:initials="SR" w:date="2026-10-26T04:32:19Z">
+  <w:comment w:id="123" w:author="Simulated reviewers" w:initials="SR" w:date="2026-10-26T10:12:20Z">
     <w:p>
       <w:pPr>
         <w:pStyle w:val="CommentText"/>
@@ -12316,7 +12432,7 @@
       </w:r>
     </w:p>
   </w:comment>
-  <w:comment w:id="124" w:author="Simulated reviewers" w:initials="SR" w:date="2026-10-26T04:32:19Z">
+  <w:comment w:id="124" w:author="Simulated reviewers" w:initials="SR" w:date="2026-10-26T10:12:20Z">
     <w:p>
       <w:pPr>
         <w:pStyle w:val="CommentText"/>
@@ -12332,7 +12448,7 @@
       </w:r>
     </w:p>
   </w:comment>
-  <w:comment w:id="125" w:author="Simulated reviewers" w:initials="SR" w:date="2026-10-26T04:32:19Z">
+  <w:comment w:id="125" w:author="Simulated reviewers" w:initials="SR" w:date="2026-10-26T10:12:20Z">
     <w:p>
       <w:pPr>
         <w:pStyle w:val="CommentText"/>
@@ -12348,7 +12464,7 @@
       </w:r>
     </w:p>
   </w:comment>
-  <w:comment w:id="126" w:author="Simulated reviewers" w:initials="SR" w:date="2026-10-26T04:32:19Z">
+  <w:comment w:id="126" w:author="Simulated reviewers" w:initials="SR" w:date="2026-10-26T10:12:20Z">
     <w:p>
       <w:pPr>
         <w:pStyle w:val="CommentText"/>
@@ -12364,7 +12480,7 @@
       </w:r>
     </w:p>
   </w:comment>
-  <w:comment w:id="127" w:author="Simulated reviewers" w:initials="SR" w:date="2026-10-26T04:32:19Z">
+  <w:comment w:id="127" w:author="Simulated reviewers" w:initials="SR" w:date="2026-10-26T10:12:20Z">
     <w:p>
       <w:pPr>
         <w:pStyle w:val="CommentText"/>
@@ -12380,7 +12496,7 @@
       </w:r>
     </w:p>
   </w:comment>
-  <w:comment w:id="128" w:author="Simulated reviewers" w:initials="SR" w:date="2026-10-26T04:32:19Z">
+  <w:comment w:id="128" w:author="Simulated reviewers" w:initials="SR" w:date="2026-10-26T10:12:20Z">
     <w:p>
       <w:pPr>
         <w:pStyle w:val="CommentText"/>
@@ -12396,7 +12512,7 @@
       </w:r>
     </w:p>
   </w:comment>
-  <w:comment w:id="129" w:author="Simulated reviewers" w:initials="SR" w:date="2026-10-26T04:32:19Z">
+  <w:comment w:id="129" w:author="Simulated reviewers" w:initials="SR" w:date="2026-10-26T10:12:20Z">
     <w:p>
       <w:pPr>
         <w:pStyle w:val="CommentText"/>
@@ -12412,7 +12528,7 @@
       </w:r>
     </w:p>
   </w:comment>
-  <w:comment w:id="130" w:author="Simulated reviewers" w:initials="SR" w:date="2026-10-26T04:32:19Z">
+  <w:comment w:id="130" w:author="Simulated reviewers" w:initials="SR" w:date="2026-10-26T10:12:20Z">
     <w:p>
       <w:pPr>
         <w:pStyle w:val="CommentText"/>
@@ -12428,7 +12544,7 @@
       </w:r>
     </w:p>
   </w:comment>
-  <w:comment w:id="131" w:author="Figures and tables" w:initials="FA" w:date="2026-10-26T04:32:19Z">
+  <w:comment w:id="131" w:author="Figures and tables" w:initials="FA" w:date="2026-10-26T10:12:20Z">
     <w:p>
       <w:pPr>
         <w:pStyle w:val="CommentText"/>
@@ -12444,7 +12560,7 @@
       </w:r>
     </w:p>
   </w:comment>
-  <w:comment w:id="132" w:author="Policy fit" w:initials="PF" w:date="2026-10-26T04:32:19Z">
+  <w:comment w:id="132" w:author="Policy fit" w:initials="PF" w:date="2026-10-26T10:12:20Z">
     <w:p>
       <w:pPr>
         <w:pStyle w:val="CommentText"/>
@@ -12460,7 +12576,7 @@
       </w:r>
     </w:p>
   </w:comment>
-  <w:comment w:id="133" w:author="Policy fit" w:initials="PF" w:date="2026-10-26T04:32:19Z">
+  <w:comment w:id="133" w:author="Policy fit" w:initials="PF" w:date="2026-10-26T10:12:20Z">
     <w:p>
       <w:pPr>
         <w:pStyle w:val="CommentText"/>
@@ -12476,7 +12592,7 @@
       </w:r>
     </w:p>
   </w:comment>
-  <w:comment w:id="134" w:author="Policy fit" w:initials="PF" w:date="2026-10-26T04:32:19Z">
+  <w:comment w:id="134" w:author="Policy fit" w:initials="PF" w:date="2026-10-26T10:12:20Z">
     <w:p>
       <w:pPr>
         <w:pStyle w:val="CommentText"/>
@@ -12492,7 +12608,7 @@
       </w:r>
     </w:p>
   </w:comment>
-  <w:comment w:id="135" w:author="Policy fit" w:initials="PF" w:date="2026-10-26T04:32:19Z">
+  <w:comment w:id="135" w:author="Policy fit" w:initials="PF" w:date="2026-10-26T10:12:20Z">
     <w:p>
       <w:pPr>
         <w:pStyle w:val="CommentText"/>
@@ -12508,7 +12624,7 @@
       </w:r>
     </w:p>
   </w:comment>
-  <w:comment w:id="136" w:author="Policy fit" w:initials="PF" w:date="2026-10-26T04:32:19Z">
+  <w:comment w:id="136" w:author="Policy fit" w:initials="PF" w:date="2026-10-26T10:12:20Z">
     <w:p>
       <w:pPr>
         <w:pStyle w:val="CommentText"/>
@@ -12524,7 +12640,7 @@
       </w:r>
     </w:p>
   </w:comment>
-  <w:comment w:id="137" w:author="Policy fit" w:initials="PF" w:date="2026-10-26T04:32:19Z">
+  <w:comment w:id="137" w:author="Policy fit" w:initials="PF" w:date="2026-10-26T10:12:20Z">
     <w:p>
       <w:pPr>
         <w:pStyle w:val="CommentText"/>
@@ -12540,7 +12656,7 @@
       </w:r>
     </w:p>
   </w:comment>
-  <w:comment w:id="138" w:author="Prose edit" w:initials="PE" w:date="2026-10-26T04:32:19Z">
+  <w:comment w:id="138" w:author="Prose edit" w:initials="PE" w:date="2026-10-26T10:12:20Z">
     <w:p>
       <w:pPr>
         <w:pStyle w:val="CommentText"/>
@@ -12556,7 +12672,7 @@
       </w:r>
     </w:p>
   </w:comment>
-  <w:comment w:id="139" w:author="Prose edit" w:initials="PE" w:date="2026-10-26T04:32:19Z">
+  <w:comment w:id="139" w:author="Prose edit" w:initials="PE" w:date="2026-10-26T10:12:20Z">
     <w:p>
       <w:pPr>
         <w:pStyle w:val="CommentText"/>
@@ -12572,7 +12688,7 @@
       </w:r>
     </w:p>
   </w:comment>
-  <w:comment w:id="140" w:author="Prose edit" w:initials="PE" w:date="2026-10-26T04:32:19Z">
+  <w:comment w:id="140" w:author="Prose edit" w:initials="PE" w:date="2026-10-26T10:12:20Z">
     <w:p>
       <w:pPr>
         <w:pStyle w:val="CommentText"/>
@@ -12588,7 +12704,7 @@
       </w:r>
     </w:p>
   </w:comment>
-  <w:comment w:id="141" w:author="Prose edit" w:initials="PE" w:date="2026-10-26T04:32:19Z">
+  <w:comment w:id="141" w:author="Prose edit" w:initials="PE" w:date="2026-10-26T10:12:20Z">
     <w:p>
       <w:pPr>
         <w:pStyle w:val="CommentText"/>
@@ -12604,7 +12720,7 @@
       </w:r>
     </w:p>
   </w:comment>
-  <w:comment w:id="142" w:author="Prose edit" w:initials="PE" w:date="2026-10-26T04:32:19Z">
+  <w:comment w:id="142" w:author="Prose edit" w:initials="PE" w:date="2026-10-26T10:12:20Z">
     <w:p>
       <w:pPr>
         <w:pStyle w:val="CommentText"/>
@@ -12620,7 +12736,7 @@
       </w:r>
     </w:p>
   </w:comment>
-  <w:comment w:id="143" w:author="Prose edit" w:initials="PE" w:date="2026-10-26T04:32:19Z">
+  <w:comment w:id="143" w:author="Prose edit" w:initials="PE" w:date="2026-10-26T10:12:20Z">
     <w:p>
       <w:pPr>
         <w:pStyle w:val="CommentText"/>
@@ -12636,7 +12752,7 @@
       </w:r>
     </w:p>
   </w:comment>
-  <w:comment w:id="144" w:author="Prose edit" w:initials="PE" w:date="2026-10-26T04:32:19Z">
+  <w:comment w:id="144" w:author="Prose edit" w:initials="PE" w:date="2026-10-26T10:12:20Z">
     <w:p>
       <w:pPr>
         <w:pStyle w:val="CommentText"/>
@@ -12652,7 +12768,7 @@
       </w:r>
     </w:p>
   </w:comment>
-  <w:comment w:id="145" w:author="Prose edit" w:initials="PE" w:date="2026-10-26T04:32:19Z">
+  <w:comment w:id="145" w:author="Prose edit" w:initials="PE" w:date="2026-10-26T10:12:20Z">
     <w:p>
       <w:pPr>
         <w:pStyle w:val="CommentText"/>
@@ -12668,7 +12784,7 @@
       </w:r>
     </w:p>
   </w:comment>
-  <w:comment w:id="146" w:author="Prose edit" w:initials="PE" w:date="2026-10-26T04:32:19Z">
+  <w:comment w:id="146" w:author="Prose edit" w:initials="PE" w:date="2026-10-26T10:12:20Z">
     <w:p>
       <w:pPr>
         <w:pStyle w:val="CommentText"/>
@@ -12684,7 +12800,7 @@
       </w:r>
     </w:p>
   </w:comment>
-  <w:comment w:id="147" w:author="Reference check" w:initials="RC" w:date="2026-10-26T04:32:19Z">
+  <w:comment w:id="147" w:author="Reference check" w:initials="RC" w:date="2026-10-26T10:12:20Z">
     <w:p>
       <w:pPr>
         <w:pStyle w:val="CommentText"/>
@@ -12700,7 +12816,7 @@
       </w:r>
     </w:p>
   </w:comment>
-  <w:comment w:id="148" w:author="Integrity check" w:initials="IC" w:date="2026-10-26T04:32:19Z">
+  <w:comment w:id="148" w:author="Integrity check" w:initials="IC" w:date="2026-10-26T10:12:20Z">
     <w:p>
       <w:pPr>
         <w:pStyle w:val="CommentText"/>
@@ -12716,7 +12832,7 @@
       </w:r>
     </w:p>
   </w:comment>
-  <w:comment w:id="149" w:author="Reference check" w:initials="RC" w:date="2026-10-26T04:32:19Z">
+  <w:comment w:id="149" w:author="Reference check" w:initials="RC" w:date="2026-10-26T10:12:20Z">
     <w:p>
       <w:pPr>
         <w:pStyle w:val="CommentText"/>
@@ -12732,7 +12848,7 @@
       </w:r>
     </w:p>
   </w:comment>
-  <w:comment w:id="150" w:author="Reference check" w:initials="RC" w:date="2026-10-26T04:32:19Z">
+  <w:comment w:id="150" w:author="Reference check" w:initials="RC" w:date="2026-10-26T10:12:20Z">
     <w:p>
       <w:pPr>
         <w:pStyle w:val="CommentText"/>
@@ -12748,7 +12864,7 @@
       </w:r>
     </w:p>
   </w:comment>
-  <w:comment w:id="151" w:author="Reference check" w:initials="RC" w:date="2026-10-26T04:32:19Z">
+  <w:comment w:id="151" w:author="Reference check" w:initials="RC" w:date="2026-10-26T10:12:20Z">
     <w:p>
       <w:pPr>
         <w:pStyle w:val="CommentText"/>
@@ -12764,7 +12880,7 @@
       </w:r>
     </w:p>
   </w:comment>
-  <w:comment w:id="152" w:author="Reference check" w:initials="RC" w:date="2026-10-26T04:32:19Z">
+  <w:comment w:id="152" w:author="Reference check" w:initials="RC" w:date="2026-10-26T10:12:20Z">
     <w:p>
       <w:pPr>
         <w:pStyle w:val="CommentText"/>
@@ -12780,7 +12896,7 @@
       </w:r>
     </w:p>
   </w:comment>
-  <w:comment w:id="153" w:author="Reference check" w:initials="RC" w:date="2026-10-26T04:32:19Z">
+  <w:comment w:id="153" w:author="Reference check" w:initials="RC" w:date="2026-10-26T10:12:20Z">
     <w:p>
       <w:pPr>
         <w:pStyle w:val="CommentText"/>
@@ -12796,7 +12912,7 @@
       </w:r>
     </w:p>
   </w:comment>
-  <w:comment w:id="154" w:author="Reference check" w:initials="RC" w:date="2026-10-26T04:32:19Z">
+  <w:comment w:id="154" w:author="Reference check" w:initials="RC" w:date="2026-10-26T10:12:20Z">
     <w:p>
       <w:pPr>
         <w:pStyle w:val="CommentText"/>
@@ -12812,7 +12928,7 @@
       </w:r>
     </w:p>
   </w:comment>
-  <w:comment w:id="155" w:author="Reference check" w:initials="RC" w:date="2026-10-26T04:32:19Z">
+  <w:comment w:id="155" w:author="Reference check" w:initials="RC" w:date="2026-10-26T10:12:20Z">
     <w:p>
       <w:pPr>
         <w:pStyle w:val="CommentText"/>
@@ -12828,7 +12944,7 @@
       </w:r>
     </w:p>
   </w:comment>
-  <w:comment w:id="156" w:author="Reference check" w:initials="RC" w:date="2026-10-26T04:32:19Z">
+  <w:comment w:id="156" w:author="Reference check" w:initials="RC" w:date="2026-10-26T10:12:20Z">
     <w:p>
       <w:pPr>
         <w:pStyle w:val="CommentText"/>
@@ -12844,7 +12960,7 @@
       </w:r>
     </w:p>
   </w:comment>
-  <w:comment w:id="157" w:author="Reporting check" w:initials="RC" w:date="2026-10-26T04:32:19Z">
+  <w:comment w:id="157" w:author="Reporting check" w:initials="RC" w:date="2026-10-26T10:12:20Z">
     <w:p>
       <w:pPr>
         <w:pStyle w:val="CommentText"/>
@@ -12860,7 +12976,7 @@
       </w:r>
     </w:p>
   </w:comment>
-  <w:comment w:id="158" w:author="Reporting check" w:initials="RC" w:date="2026-10-26T04:32:19Z">
+  <w:comment w:id="158" w:author="Reporting check" w:initials="RC" w:date="2026-10-26T10:12:20Z">
     <w:p>
       <w:pPr>
         <w:pStyle w:val="CommentText"/>
@@ -12876,7 +12992,7 @@
       </w:r>
     </w:p>
   </w:comment>
-  <w:comment w:id="159" w:author="Reporting check" w:initials="RC" w:date="2026-10-26T04:32:19Z">
+  <w:comment w:id="159" w:author="Reporting check" w:initials="RC" w:date="2026-10-26T10:12:20Z">
     <w:p>
       <w:pPr>
         <w:pStyle w:val="CommentText"/>
@@ -12892,7 +13008,7 @@
       </w:r>
     </w:p>
   </w:comment>
-  <w:comment w:id="160" w:author="Reporting check" w:initials="RC" w:date="2026-10-26T04:32:19Z">
+  <w:comment w:id="160" w:author="Reporting check" w:initials="RC" w:date="2026-10-26T10:12:20Z">
     <w:p>
       <w:pPr>
         <w:pStyle w:val="CommentText"/>
@@ -12908,7 +13024,7 @@
       </w:r>
     </w:p>
   </w:comment>
-  <w:comment w:id="161" w:author="Reporting check" w:initials="RC" w:date="2026-10-26T04:32:19Z">
+  <w:comment w:id="161" w:author="Reporting check" w:initials="RC" w:date="2026-10-26T10:12:20Z">
     <w:p>
       <w:pPr>
         <w:pStyle w:val="CommentText"/>
@@ -12924,7 +13040,7 @@
       </w:r>
     </w:p>
   </w:comment>
-  <w:comment w:id="162" w:author="Reporting check" w:initials="RC" w:date="2026-10-26T04:32:19Z">
+  <w:comment w:id="162" w:author="Reporting check" w:initials="RC" w:date="2026-10-26T10:12:20Z">
     <w:p>
       <w:pPr>
         <w:pStyle w:val="CommentText"/>
@@ -12940,7 +13056,7 @@
       </w:r>
     </w:p>
   </w:comment>
-  <w:comment w:id="163" w:author="Reporting check" w:initials="RC" w:date="2026-10-26T04:32:19Z">
+  <w:comment w:id="163" w:author="Reporting check" w:initials="RC" w:date="2026-10-26T10:12:20Z">
     <w:p>
       <w:pPr>
         <w:pStyle w:val="CommentText"/>
@@ -12956,7 +13072,7 @@
       </w:r>
     </w:p>
   </w:comment>
-  <w:comment w:id="164" w:author="Integrity check" w:initials="IC" w:date="2026-10-26T04:32:19Z">
+  <w:comment w:id="164" w:author="Integrity check" w:initials="IC" w:date="2026-10-26T10:12:20Z">
     <w:p>
       <w:pPr>
         <w:pStyle w:val="CommentText"/>
@@ -12972,7 +13088,7 @@
       </w:r>
     </w:p>
   </w:comment>
-  <w:comment w:id="165" w:author="Reporting check" w:initials="RC" w:date="2026-10-26T04:32:19Z">
+  <w:comment w:id="165" w:author="Reporting check" w:initials="RC" w:date="2026-10-26T10:12:20Z">
     <w:p>
       <w:pPr>
         <w:pStyle w:val="CommentText"/>
@@ -12988,7 +13104,7 @@
       </w:r>
     </w:p>
   </w:comment>
-  <w:comment w:id="166" w:author="Story" w:initials="S" w:date="2026-10-26T04:32:19Z">
+  <w:comment w:id="166" w:author="Story" w:initials="S" w:date="2026-10-26T10:12:20Z">
     <w:p>
       <w:pPr>
         <w:pStyle w:val="CommentText"/>
@@ -13004,7 +13120,7 @@
       </w:r>
     </w:p>
   </w:comment>
-  <w:comment w:id="167" w:author="Story" w:initials="S" w:date="2026-10-26T04:32:19Z">
+  <w:comment w:id="167" w:author="Story" w:initials="S" w:date="2026-10-26T10:12:20Z">
     <w:p>
       <w:pPr>
         <w:pStyle w:val="CommentText"/>
@@ -13020,7 +13136,7 @@
       </w:r>
     </w:p>
   </w:comment>
-  <w:comment w:id="168" w:author="Story" w:initials="S" w:date="2026-10-26T04:32:19Z">
+  <w:comment w:id="168" w:author="Story" w:initials="S" w:date="2026-10-26T10:12:20Z">
     <w:p>
       <w:pPr>
         <w:pStyle w:val="CommentText"/>
@@ -13036,7 +13152,7 @@
       </w:r>
     </w:p>
   </w:comment>
-  <w:comment w:id="169" w:author="Story" w:initials="S" w:date="2026-10-26T04:32:19Z">
+  <w:comment w:id="169" w:author="Story" w:initials="S" w:date="2026-10-26T10:12:20Z">
     <w:p>
       <w:pPr>
         <w:pStyle w:val="CommentText"/>
@@ -13052,7 +13168,7 @@
       </w:r>
     </w:p>
   </w:comment>
-  <w:comment w:id="170" w:author="Story" w:initials="S" w:date="2026-10-26T04:32:19Z">
+  <w:comment w:id="170" w:author="Story" w:initials="S" w:date="2026-10-26T10:12:21Z">
     <w:p>
       <w:pPr>
         <w:pStyle w:val="CommentText"/>
@@ -13068,7 +13184,7 @@
       </w:r>
     </w:p>
   </w:comment>
-  <w:comment w:id="171" w:author="Figures and tables" w:initials="FA" w:date="2026-10-26T04:32:19Z">
+  <w:comment w:id="171" w:author="Figures and tables" w:initials="FA" w:date="2026-10-26T10:12:21Z">
     <w:p>
       <w:pPr>
         <w:pStyle w:val="CommentText"/>
@@ -13084,7 +13200,7 @@
       </w:r>
     </w:p>
   </w:comment>
-  <w:comment w:id="172" w:author="Figures and tables" w:initials="FA" w:date="2026-10-26T04:32:19Z">
+  <w:comment w:id="172" w:author="Figures and tables" w:initials="FA" w:date="2026-10-26T10:12:21Z">
     <w:p>
       <w:pPr>
         <w:pStyle w:val="CommentText"/>
@@ -13100,7 +13216,7 @@
       </w:r>
     </w:p>
   </w:comment>
-  <w:comment w:id="173" w:author="Figures and tables" w:initials="FA" w:date="2026-10-26T04:32:19Z">
+  <w:comment w:id="173" w:author="Figures and tables" w:initials="FA" w:date="2026-10-26T10:12:21Z">
     <w:p>
       <w:pPr>
         <w:pStyle w:val="CommentText"/>
@@ -13116,7 +13232,7 @@
       </w:r>
     </w:p>
   </w:comment>
-  <w:comment w:id="174" w:author="Simulated reviewers" w:initials="SR" w:date="2026-10-26T04:32:19Z">
+  <w:comment w:id="174" w:author="Simulated reviewers" w:initials="SR" w:date="2026-10-26T10:12:21Z">
     <w:p>
       <w:pPr>
         <w:pStyle w:val="CommentText"/>
@@ -13132,7 +13248,7 @@
       </w:r>
     </w:p>
   </w:comment>
-  <w:comment w:id="175" w:author="Story" w:initials="S" w:date="2026-10-26T04:32:19Z">
+  <w:comment w:id="175" w:author="Story" w:initials="S" w:date="2026-10-26T10:12:21Z">
     <w:p>
       <w:pPr>
         <w:pStyle w:val="CommentText"/>
@@ -13148,7 +13264,7 @@
       </w:r>
     </w:p>
   </w:comment>
-  <w:comment w:id="176" w:author="Story" w:initials="S" w:date="2026-10-26T04:32:19Z">
+  <w:comment w:id="176" w:author="Story" w:initials="S" w:date="2026-10-26T10:12:21Z">
     <w:p>
       <w:pPr>
         <w:pStyle w:val="CommentText"/>
@@ -13164,7 +13280,7 @@
       </w:r>
     </w:p>
   </w:comment>
-  <w:comment w:id="177" w:author="Story" w:initials="S" w:date="2026-10-26T04:32:19Z">
+  <w:comment w:id="177" w:author="Story" w:initials="S" w:date="2026-10-26T10:12:21Z">
     <w:p>
       <w:pPr>
         <w:pStyle w:val="CommentText"/>
@@ -13180,7 +13296,7 @@
       </w:r>
     </w:p>
   </w:comment>
-  <w:comment w:id="178" w:author="Story" w:initials="S" w:date="2026-10-26T04:32:19Z">
+  <w:comment w:id="178" w:author="Story" w:initials="S" w:date="2026-10-26T10:12:21Z">
     <w:p>
       <w:pPr>
         <w:pStyle w:val="CommentText"/>
@@ -13196,7 +13312,7 @@
       </w:r>
     </w:p>
   </w:comment>
-  <w:comment w:id="179" w:author="Story" w:initials="S" w:date="2026-10-26T04:32:19Z">
+  <w:comment w:id="179" w:author="Story" w:initials="S" w:date="2026-10-26T10:12:21Z">
     <w:p>
       <w:pPr>
         <w:pStyle w:val="CommentText"/>
@@ -13212,7 +13328,7 @@
       </w:r>
     </w:p>
   </w:comment>
-  <w:comment w:id="180" w:author="Story" w:initials="S" w:date="2026-10-26T04:32:19Z">
+  <w:comment w:id="180" w:author="Story" w:initials="S" w:date="2026-10-26T10:12:21Z">
     <w:p>
       <w:pPr>
         <w:pStyle w:val="CommentText"/>
@@ -13228,7 +13344,7 @@
       </w:r>
     </w:p>
   </w:comment>
-  <w:comment w:id="181" w:author="Story" w:initials="S" w:date="2026-10-26T04:32:19Z">
+  <w:comment w:id="181" w:author="Story" w:initials="S" w:date="2026-10-26T10:12:21Z">
     <w:p>
       <w:pPr>
         <w:pStyle w:val="CommentText"/>
@@ -13244,7 +13360,7 @@
       </w:r>
     </w:p>
   </w:comment>
-  <w:comment w:id="182" w:author="Story" w:initials="S" w:date="2026-10-26T04:32:19Z">
+  <w:comment w:id="182" w:author="Story" w:initials="S" w:date="2026-10-26T10:12:21Z">
     <w:p>
       <w:pPr>
         <w:pStyle w:val="CommentText"/>
@@ -13260,7 +13376,7 @@
       </w:r>
     </w:p>
   </w:comment>
-  <w:comment w:id="183" w:author="Workflow" w:initials="W" w:date="2026-10-26T04:32:19Z">
+  <w:comment w:id="183" w:author="Workflow" w:initials="W" w:date="2026-10-26T10:12:21Z">
     <w:p>
       <w:pPr>
         <w:pStyle w:val="CommentText"/>
@@ -13436,7 +13552,7 @@
       </w:r>
     </w:p>
   </w:comment>
-  <w:comment w:id="184" w:author="Workflow" w:initials="W" w:date="2026-10-26T04:32:19Z">
+  <w:comment w:id="184" w:author="Workflow" w:initials="W" w:date="2026-10-26T10:12:21Z">
     <w:p>
       <w:pPr>
         <w:pStyle w:val="CommentText"/>
@@ -13460,7 +13576,7 @@
       </w:r>
     </w:p>
   </w:comment>
-  <w:comment w:id="185" w:author="Workflow" w:initials="W" w:date="2026-10-26T04:32:19Z">
+  <w:comment w:id="185" w:author="Workflow" w:initials="W" w:date="2026-10-26T10:12:21Z">
     <w:p>
       <w:pPr>
         <w:pStyle w:val="CommentText"/>
@@ -13484,7 +13600,7 @@
       </w:r>
     </w:p>
   </w:comment>
-  <w:comment w:id="186" w:author="Workflow" w:initials="W" w:date="2026-10-26T04:32:19Z">
+  <w:comment w:id="186" w:author="Workflow" w:initials="W" w:date="2026-10-26T10:12:21Z">
     <w:p>
       <w:pPr>
         <w:pStyle w:val="CommentText"/>
@@ -13516,7 +13632,7 @@
       </w:r>
     </w:p>
   </w:comment>
-  <w:comment w:id="187" w:author="Workflow" w:initials="W" w:date="2026-10-26T04:32:19Z">
+  <w:comment w:id="187" w:author="Workflow" w:initials="W" w:date="2026-10-26T10:12:21Z">
     <w:p>
       <w:pPr>
         <w:pStyle w:val="CommentText"/>
@@ -13540,7 +13656,7 @@
       </w:r>
     </w:p>
   </w:comment>
-  <w:comment w:id="188" w:author="Workflow" w:initials="W" w:date="2026-10-26T04:32:19Z">
+  <w:comment w:id="188" w:author="Workflow" w:initials="W" w:date="2026-10-26T10:12:21Z">
     <w:p>
       <w:pPr>
         <w:pStyle w:val="CommentText"/>

</xml_diff>